<commit_message>
longer training better result
</commit_message>
<xml_diff>
--- a/NotizenModell.docx
+++ b/NotizenModell.docx
@@ -51,14 +51,78 @@
           <w:i/>
           <w:iCs/>
         </w:rPr>
-        <w:t xml:space="preserve">it limits für gelenke in UF_KinemtaicTree forces Zeile 199 </w:t>
-      </w:r>
+        <w:t xml:space="preserve">it </w:t>
+      </w:r>
+      <w:proofErr w:type="spellStart"/>
       <w:r>
         <w:rPr>
           <w:i/>
           <w:iCs/>
         </w:rPr>
-        <w:t>-&gt; Gersti fragen</w:t>
+        <w:t>limits</w:t>
+      </w:r>
+      <w:proofErr w:type="spellEnd"/>
+      <w:r>
+        <w:rPr>
+          <w:i/>
+          <w:iCs/>
+        </w:rPr>
+        <w:t xml:space="preserve"> für gelenke in </w:t>
+      </w:r>
+      <w:proofErr w:type="spellStart"/>
+      <w:r>
+        <w:rPr>
+          <w:i/>
+          <w:iCs/>
+        </w:rPr>
+        <w:t>UF_KinemtaicTree</w:t>
+      </w:r>
+      <w:proofErr w:type="spellEnd"/>
+      <w:r>
+        <w:rPr>
+          <w:i/>
+          <w:iCs/>
+        </w:rPr>
+        <w:t xml:space="preserve"> </w:t>
+      </w:r>
+      <w:proofErr w:type="spellStart"/>
+      <w:r>
+        <w:rPr>
+          <w:i/>
+          <w:iCs/>
+        </w:rPr>
+        <w:t>forces</w:t>
+      </w:r>
+      <w:proofErr w:type="spellEnd"/>
+      <w:r>
+        <w:rPr>
+          <w:i/>
+          <w:iCs/>
+        </w:rPr>
+        <w:t xml:space="preserve"> Zeile 199 </w:t>
+      </w:r>
+      <w:r>
+        <w:rPr>
+          <w:i/>
+          <w:iCs/>
+        </w:rPr>
+        <w:t xml:space="preserve">-&gt; </w:t>
+      </w:r>
+      <w:proofErr w:type="spellStart"/>
+      <w:r>
+        <w:rPr>
+          <w:i/>
+          <w:iCs/>
+        </w:rPr>
+        <w:t>Gersti</w:t>
+      </w:r>
+      <w:proofErr w:type="spellEnd"/>
+      <w:r>
+        <w:rPr>
+          <w:i/>
+          <w:iCs/>
+        </w:rPr>
+        <w:t xml:space="preserve"> fragen</w:t>
       </w:r>
     </w:p>
     <w:p>
@@ -66,7 +130,31 @@
         <w:ind w:left="708"/>
       </w:pPr>
       <w:r>
-        <w:t>Ich simuliere gar nicht wo die joint limits vorkomen, schon beschränken in Winkel die vorgegeben werden</w:t>
+        <w:t xml:space="preserve">Ich simuliere gar nicht wo die </w:t>
+      </w:r>
+      <w:proofErr w:type="spellStart"/>
+      <w:r>
+        <w:t>joint</w:t>
+      </w:r>
+      <w:proofErr w:type="spellEnd"/>
+      <w:r>
+        <w:t xml:space="preserve"> </w:t>
+      </w:r>
+      <w:proofErr w:type="spellStart"/>
+      <w:r>
+        <w:t>limits</w:t>
+      </w:r>
+      <w:proofErr w:type="spellEnd"/>
+      <w:r>
+        <w:t xml:space="preserve"> </w:t>
+      </w:r>
+      <w:proofErr w:type="spellStart"/>
+      <w:r>
+        <w:t>vorkomen</w:t>
+      </w:r>
+      <w:proofErr w:type="spellEnd"/>
+      <w:r>
+        <w:t>, schon beschränken in Winkel die vorgegeben werden</w:t>
       </w:r>
     </w:p>
     <w:p>
@@ -74,7 +162,23 @@
         <w:ind w:left="708"/>
       </w:pPr>
       <w:r>
-        <w:t xml:space="preserve">Er zittert wahrscheinlich weil er zwischen limits hin und herfährt </w:t>
+        <w:t xml:space="preserve">Er zittert </w:t>
+      </w:r>
+      <w:proofErr w:type="gramStart"/>
+      <w:r>
+        <w:t>wahrscheinlich</w:t>
+      </w:r>
+      <w:proofErr w:type="gramEnd"/>
+      <w:r>
+        <w:t xml:space="preserve"> weil er zwischen </w:t>
+      </w:r>
+      <w:proofErr w:type="spellStart"/>
+      <w:r>
+        <w:t>limits</w:t>
+      </w:r>
+      <w:proofErr w:type="spellEnd"/>
+      <w:r>
+        <w:t xml:space="preserve"> hin und herfährt </w:t>
       </w:r>
     </w:p>
     <w:p>
@@ -82,7 +186,15 @@
         <w:ind w:left="708"/>
       </w:pPr>
       <w:r>
-        <w:t xml:space="preserve">Besser: bei bahnplanung vorgeben </w:t>
+        <w:t xml:space="preserve">Besser: bei </w:t>
+      </w:r>
+      <w:proofErr w:type="spellStart"/>
+      <w:r>
+        <w:t>bahnplanung</w:t>
+      </w:r>
+      <w:proofErr w:type="spellEnd"/>
+      <w:r>
+        <w:t xml:space="preserve"> vorgeben </w:t>
       </w:r>
     </w:p>
     <w:p>
@@ -90,16 +202,82 @@
         <w:ind w:left="708"/>
       </w:pPr>
       <w:r>
-        <w:t>Bei action vorgeben (man würde winkel nicht direkt vorgeben sondern pd regler</w:t>
-      </w:r>
+        <w:t xml:space="preserve">Bei </w:t>
+      </w:r>
+      <w:proofErr w:type="spellStart"/>
+      <w:r>
+        <w:t>action</w:t>
+      </w:r>
+      <w:proofErr w:type="spellEnd"/>
+      <w:r>
+        <w:t xml:space="preserve"> vorgeben (man würde </w:t>
+      </w:r>
+      <w:proofErr w:type="spellStart"/>
+      <w:r>
+        <w:t>winkel</w:t>
+      </w:r>
+      <w:proofErr w:type="spellEnd"/>
+      <w:r>
+        <w:t xml:space="preserve"> nicht direkt </w:t>
+      </w:r>
+      <w:proofErr w:type="gramStart"/>
+      <w:r>
+        <w:t>vorgeben</w:t>
+      </w:r>
+      <w:proofErr w:type="gramEnd"/>
+      <w:r>
+        <w:t xml:space="preserve"> sondern </w:t>
+      </w:r>
+      <w:proofErr w:type="spellStart"/>
+      <w:r>
+        <w:t>pd</w:t>
+      </w:r>
+      <w:proofErr w:type="spellEnd"/>
+      <w:r>
+        <w:t xml:space="preserve"> </w:t>
+      </w:r>
+      <w:proofErr w:type="spellStart"/>
+      <w:r>
+        <w:t>regler</w:t>
+      </w:r>
+      <w:proofErr w:type="spellEnd"/>
     </w:p>
     <w:p>
       <w:pPr>
         <w:ind w:left="708"/>
       </w:pPr>
       <w:r>
-        <w:t>Ohne joints limits kein zittern, wir brauchen keine user function</w:t>
-      </w:r>
+        <w:t xml:space="preserve">Ohne </w:t>
+      </w:r>
+      <w:proofErr w:type="spellStart"/>
+      <w:r>
+        <w:t>joints</w:t>
+      </w:r>
+      <w:proofErr w:type="spellEnd"/>
+      <w:r>
+        <w:t xml:space="preserve"> </w:t>
+      </w:r>
+      <w:proofErr w:type="spellStart"/>
+      <w:r>
+        <w:t>limits</w:t>
+      </w:r>
+      <w:proofErr w:type="spellEnd"/>
+      <w:r>
+        <w:t xml:space="preserve"> kein zittern, wir brauchen keine </w:t>
+      </w:r>
+      <w:proofErr w:type="spellStart"/>
+      <w:r>
+        <w:t>user</w:t>
+      </w:r>
+      <w:proofErr w:type="spellEnd"/>
+      <w:r>
+        <w:t xml:space="preserve"> </w:t>
+      </w:r>
+      <w:proofErr w:type="spellStart"/>
+      <w:r>
+        <w:t>function</w:t>
+      </w:r>
+      <w:proofErr w:type="spellEnd"/>
     </w:p>
     <w:p>
       <w:pPr>
@@ -111,33 +289,179 @@
         <w:ind w:left="1428"/>
       </w:pPr>
       <w:r>
-        <w:t xml:space="preserve">Siehe wie es im anderen Hund gelöst wurde, da sollte es die bahnplanung geben </w:t>
-      </w:r>
-      <w:r>
-        <w:t>(spotModel)</w:t>
-      </w:r>
-    </w:p>
-    <w:p>
-      <w:r>
-        <w:t xml:space="preserve">PD werte folgen auch der numerierung wie die Gelnke nummeriert sind (siehe jointDcontrolVector (dämpfung sollte nicht zu groß werden) und jointPcontrolVector) die beiden setzen, Offset über jointPositionOffsetVector setzen von position und geschwindigkeitswert vorgeben als z value, das ist eingang für reinforcement learning (siehe zeile 357,358) wir geben nur position vor </w:t>
-      </w:r>
-    </w:p>
-    <w:p/>
-    <w:p>
-      <w:r>
-        <w:t>In der funktion</w:t>
-      </w:r>
+        <w:t xml:space="preserve">Siehe wie es im anderen Hund gelöst wurde, da sollte es die </w:t>
+      </w:r>
+      <w:proofErr w:type="spellStart"/>
+      <w:r>
+        <w:t>bahnplanung</w:t>
+      </w:r>
+      <w:proofErr w:type="spellEnd"/>
+      <w:r>
+        <w:t xml:space="preserve"> geben </w:t>
+      </w:r>
+      <w:r>
+        <w:t>(</w:t>
+      </w:r>
+      <w:proofErr w:type="spellStart"/>
+      <w:r>
+        <w:t>spotModel</w:t>
+      </w:r>
+      <w:proofErr w:type="spellEnd"/>
+      <w:r>
+        <w:t>)</w:t>
+      </w:r>
+    </w:p>
+    <w:p>
+      <w:r>
+        <w:t xml:space="preserve">PD werte folgen auch der </w:t>
+      </w:r>
+      <w:proofErr w:type="spellStart"/>
+      <w:r>
+        <w:t>numerierung</w:t>
+      </w:r>
+      <w:proofErr w:type="spellEnd"/>
+      <w:r>
+        <w:t xml:space="preserve"> wie die </w:t>
+      </w:r>
+      <w:proofErr w:type="spellStart"/>
+      <w:r>
+        <w:t>Gelnke</w:t>
+      </w:r>
+      <w:proofErr w:type="spellEnd"/>
+      <w:r>
+        <w:t xml:space="preserve"> nummeriert sind (siehe </w:t>
+      </w:r>
+      <w:proofErr w:type="spellStart"/>
+      <w:r>
+        <w:t>jointDcontrolVector</w:t>
+      </w:r>
+      <w:proofErr w:type="spellEnd"/>
+      <w:r>
+        <w:t xml:space="preserve"> (</w:t>
+      </w:r>
+      <w:proofErr w:type="spellStart"/>
+      <w:r>
+        <w:t>dämpfung</w:t>
+      </w:r>
+      <w:proofErr w:type="spellEnd"/>
+      <w:r>
+        <w:t xml:space="preserve"> sollte nicht zu groß werden) und </w:t>
+      </w:r>
+      <w:proofErr w:type="spellStart"/>
+      <w:r>
+        <w:t>jointPcontrolVector</w:t>
+      </w:r>
+      <w:proofErr w:type="spellEnd"/>
+      <w:r>
+        <w:t xml:space="preserve">) die beiden setzen, Offset über </w:t>
+      </w:r>
+      <w:proofErr w:type="spellStart"/>
+      <w:r>
+        <w:t>jointPositionOffsetVector</w:t>
+      </w:r>
+      <w:proofErr w:type="spellEnd"/>
+      <w:r>
+        <w:t xml:space="preserve"> setzen von </w:t>
+      </w:r>
+      <w:proofErr w:type="spellStart"/>
+      <w:r>
+        <w:t>position</w:t>
+      </w:r>
+      <w:proofErr w:type="spellEnd"/>
+      <w:r>
+        <w:t xml:space="preserve"> und geschwindigkeitswert vorgeben als z </w:t>
+      </w:r>
+      <w:proofErr w:type="spellStart"/>
+      <w:r>
+        <w:t>value</w:t>
+      </w:r>
+      <w:proofErr w:type="spellEnd"/>
+      <w:r>
+        <w:t xml:space="preserve">, das ist </w:t>
+      </w:r>
+      <w:proofErr w:type="spellStart"/>
+      <w:r>
+        <w:t>eingang</w:t>
+      </w:r>
+      <w:proofErr w:type="spellEnd"/>
+      <w:r>
+        <w:t xml:space="preserve"> für </w:t>
+      </w:r>
+      <w:proofErr w:type="spellStart"/>
+      <w:r>
+        <w:t>reinforcement</w:t>
+      </w:r>
+      <w:proofErr w:type="spellEnd"/>
+      <w:r>
+        <w:t xml:space="preserve"> </w:t>
+      </w:r>
+      <w:proofErr w:type="spellStart"/>
+      <w:r>
+        <w:t>learning</w:t>
+      </w:r>
+      <w:proofErr w:type="spellEnd"/>
+      <w:r>
+        <w:t xml:space="preserve"> (siehe </w:t>
+      </w:r>
+      <w:proofErr w:type="spellStart"/>
+      <w:r>
+        <w:t>zeile</w:t>
+      </w:r>
+      <w:proofErr w:type="spellEnd"/>
+      <w:r>
+        <w:t xml:space="preserve"> 357,358) wir geben nur </w:t>
+      </w:r>
+      <w:proofErr w:type="spellStart"/>
+      <w:r>
+        <w:t>position</w:t>
+      </w:r>
+      <w:proofErr w:type="spellEnd"/>
+      <w:r>
+        <w:t xml:space="preserve"> vor </w:t>
+      </w:r>
+    </w:p>
+    <w:p/>
+    <w:p>
+      <w:r>
+        <w:t xml:space="preserve">In der </w:t>
+      </w:r>
+      <w:proofErr w:type="spellStart"/>
+      <w:r>
+        <w:t>funktion</w:t>
+      </w:r>
+      <w:proofErr w:type="spellEnd"/>
       <w:r>
         <w:t xml:space="preserve"> UF</w:t>
       </w:r>
       <w:r>
-        <w:t xml:space="preserve"> könnte dann evtl. motorsteuerung</w:t>
-      </w:r>
-    </w:p>
-    <w:p/>
-    <w:p>
-      <w:r>
-        <w:t xml:space="preserve">Startposition mit body offset </w:t>
+        <w:t xml:space="preserve"> könnte dann evtl. </w:t>
+      </w:r>
+      <w:proofErr w:type="spellStart"/>
+      <w:r>
+        <w:t>motorsteuerung</w:t>
+      </w:r>
+      <w:proofErr w:type="spellEnd"/>
+    </w:p>
+    <w:p/>
+    <w:p>
+      <w:r>
+        <w:t xml:space="preserve">Startposition mit </w:t>
+      </w:r>
+      <w:proofErr w:type="spellStart"/>
+      <w:r>
+        <w:t>body</w:t>
+      </w:r>
+      <w:proofErr w:type="spellEnd"/>
+      <w:r>
+        <w:t xml:space="preserve"> </w:t>
+      </w:r>
+      <w:proofErr w:type="spellStart"/>
+      <w:r>
+        <w:t>offset</w:t>
+      </w:r>
+      <w:proofErr w:type="spellEnd"/>
+      <w:r>
+        <w:t xml:space="preserve"> </w:t>
       </w:r>
     </w:p>
     <w:p/>
@@ -178,16 +502,104 @@
     <w:p/>
     <w:p>
       <w:r>
-        <w:t xml:space="preserve">Kontakt mit Boden-Reibung? Wenn Beinmarker in suchraum fallen kommt kontakt zustande (addtrianglerigidBase) -&gt; wie sollen wir das fürs Modell aufstellen (die parameter haben wir mit chatgpt rausgefunden; (die kommen dann in die Übergabe) </w:t>
-      </w:r>
-      <w:r>
-        <w:t>-&gt; umgändert, nur diese if abfrage die im anderen Beispiel drin ist funktioniert für uns nicht</w:t>
-      </w:r>
-    </w:p>
-    <w:p/>
-    <w:p>
-      <w:r>
-        <w:t>Zeile 67: Joints , Freiheitsgrade 3 Translation,3  Drehwinkel körper (sonst könnte hund nich umkippen), 4  y Hüfte, 4</w:t>
+        <w:t xml:space="preserve">Kontakt mit Boden-Reibung? Wenn Beinmarker in </w:t>
+      </w:r>
+      <w:proofErr w:type="spellStart"/>
+      <w:r>
+        <w:t>suchraum</w:t>
+      </w:r>
+      <w:proofErr w:type="spellEnd"/>
+      <w:r>
+        <w:t xml:space="preserve"> fallen kommt kontakt zustande (</w:t>
+      </w:r>
+      <w:proofErr w:type="spellStart"/>
+      <w:r>
+        <w:t>addtrianglerigidBase</w:t>
+      </w:r>
+      <w:proofErr w:type="spellEnd"/>
+      <w:r>
+        <w:t xml:space="preserve">) -&gt; wie sollen wir das fürs Modell aufstellen (die </w:t>
+      </w:r>
+      <w:proofErr w:type="spellStart"/>
+      <w:r>
+        <w:t>parameter</w:t>
+      </w:r>
+      <w:proofErr w:type="spellEnd"/>
+      <w:r>
+        <w:t xml:space="preserve"> haben wir mit </w:t>
+      </w:r>
+      <w:proofErr w:type="spellStart"/>
+      <w:r>
+        <w:t>chatgpt</w:t>
+      </w:r>
+      <w:proofErr w:type="spellEnd"/>
+      <w:r>
+        <w:t xml:space="preserve"> rausgefunden; (die kommen dann in die Übergabe) </w:t>
+      </w:r>
+      <w:r>
+        <w:t xml:space="preserve">-&gt; </w:t>
+      </w:r>
+      <w:proofErr w:type="spellStart"/>
+      <w:r>
+        <w:t>umgändert</w:t>
+      </w:r>
+      <w:proofErr w:type="spellEnd"/>
+      <w:r>
+        <w:t xml:space="preserve">, nur diese </w:t>
+      </w:r>
+      <w:proofErr w:type="spellStart"/>
+      <w:r>
+        <w:t>if</w:t>
+      </w:r>
+      <w:proofErr w:type="spellEnd"/>
+      <w:r>
+        <w:t xml:space="preserve"> abfrage die im anderen Beispiel drin ist funktioniert für uns nicht</w:t>
+      </w:r>
+    </w:p>
+    <w:p/>
+    <w:p>
+      <w:r>
+        <w:t xml:space="preserve">Zeile 67: </w:t>
+      </w:r>
+      <w:proofErr w:type="gramStart"/>
+      <w:r>
+        <w:t>Joints ,</w:t>
+      </w:r>
+      <w:proofErr w:type="gramEnd"/>
+      <w:r>
+        <w:t xml:space="preserve"> Freiheitsgrade 3 Translation,</w:t>
+      </w:r>
+      <w:proofErr w:type="gramStart"/>
+      <w:r>
+        <w:t>3  Drehwinkel</w:t>
+      </w:r>
+      <w:proofErr w:type="gramEnd"/>
+      <w:r>
+        <w:t xml:space="preserve"> </w:t>
+      </w:r>
+      <w:proofErr w:type="spellStart"/>
+      <w:r>
+        <w:t>körper</w:t>
+      </w:r>
+      <w:proofErr w:type="spellEnd"/>
+      <w:r>
+        <w:t xml:space="preserve"> (sonst könnte </w:t>
+      </w:r>
+      <w:proofErr w:type="spellStart"/>
+      <w:r>
+        <w:t>hund</w:t>
+      </w:r>
+      <w:proofErr w:type="spellEnd"/>
+      <w:r>
+        <w:t xml:space="preserve"> nich umkippen), </w:t>
+      </w:r>
+      <w:proofErr w:type="gramStart"/>
+      <w:r>
+        <w:t>4  y</w:t>
+      </w:r>
+      <w:proofErr w:type="gramEnd"/>
+      <w:r>
+        <w:t xml:space="preserve"> Hüfte, 4</w:t>
       </w:r>
       <w:r>
         <w:t>y</w:t>
@@ -198,35 +610,269 @@
     </w:p>
     <w:p/>
     <w:p>
-      <w:r>
-        <w:t xml:space="preserve">nKT nicht ganz sicher über aufgabe aber hauptpunkt kinematic tree (von der Node=node von kinematic tree), der bekommt inital angles </w:t>
+      <w:proofErr w:type="spellStart"/>
+      <w:r>
+        <w:t>nKT</w:t>
+      </w:r>
+      <w:proofErr w:type="spellEnd"/>
+      <w:r>
+        <w:t xml:space="preserve"> nicht ganz sicher über </w:t>
+      </w:r>
+      <w:proofErr w:type="spellStart"/>
+      <w:r>
+        <w:t>aufgabe</w:t>
+      </w:r>
+      <w:proofErr w:type="spellEnd"/>
+      <w:r>
+        <w:t xml:space="preserve"> aber </w:t>
+      </w:r>
+      <w:proofErr w:type="spellStart"/>
+      <w:r>
+        <w:t>hauptpunkt</w:t>
+      </w:r>
+      <w:proofErr w:type="spellEnd"/>
+      <w:r>
+        <w:t xml:space="preserve"> </w:t>
+      </w:r>
+      <w:proofErr w:type="spellStart"/>
+      <w:r>
+        <w:t>kinematic</w:t>
+      </w:r>
+      <w:proofErr w:type="spellEnd"/>
+      <w:r>
+        <w:t xml:space="preserve"> </w:t>
+      </w:r>
+      <w:proofErr w:type="spellStart"/>
+      <w:r>
+        <w:t>tree</w:t>
+      </w:r>
+      <w:proofErr w:type="spellEnd"/>
+      <w:r>
+        <w:t xml:space="preserve"> (von der Node=</w:t>
+      </w:r>
+      <w:proofErr w:type="spellStart"/>
+      <w:r>
+        <w:t>node</w:t>
+      </w:r>
+      <w:proofErr w:type="spellEnd"/>
+      <w:r>
+        <w:t xml:space="preserve"> von </w:t>
+      </w:r>
+      <w:proofErr w:type="spellStart"/>
+      <w:r>
+        <w:t>kinematic</w:t>
+      </w:r>
+      <w:proofErr w:type="spellEnd"/>
+      <w:r>
+        <w:t xml:space="preserve"> </w:t>
+      </w:r>
+      <w:proofErr w:type="spellStart"/>
+      <w:r>
+        <w:t>tree</w:t>
+      </w:r>
+      <w:proofErr w:type="spellEnd"/>
+      <w:r>
+        <w:t xml:space="preserve">), der bekommt </w:t>
+      </w:r>
+      <w:proofErr w:type="spellStart"/>
+      <w:r>
+        <w:t>inital</w:t>
+      </w:r>
+      <w:proofErr w:type="spellEnd"/>
+      <w:r>
+        <w:t xml:space="preserve"> </w:t>
+      </w:r>
+      <w:proofErr w:type="spellStart"/>
+      <w:r>
+        <w:t>angles</w:t>
+      </w:r>
+      <w:proofErr w:type="spellEnd"/>
+      <w:r>
+        <w:t xml:space="preserve"> </w:t>
       </w:r>
     </w:p>
     <w:p>
       <w:r>
         <w:lastRenderedPageBreak/>
-        <w:t xml:space="preserve">Man kann kinematic tree ja auch über sein Robotics Modul machen (siehe beispiel kinemtaic tree) RobotLink methode siehe openAIgymNLinkcontinous; </w:t>
+        <w:t xml:space="preserve">Man kann </w:t>
+      </w:r>
+      <w:proofErr w:type="spellStart"/>
+      <w:r>
+        <w:t>kinematic</w:t>
+      </w:r>
+      <w:proofErr w:type="spellEnd"/>
+      <w:r>
+        <w:t xml:space="preserve"> </w:t>
+      </w:r>
+      <w:proofErr w:type="spellStart"/>
+      <w:r>
+        <w:t>tree</w:t>
+      </w:r>
+      <w:proofErr w:type="spellEnd"/>
+      <w:r>
+        <w:t xml:space="preserve"> ja auch über sein Robotics Modul machen (siehe </w:t>
+      </w:r>
+      <w:proofErr w:type="spellStart"/>
+      <w:r>
+        <w:t>beispiel</w:t>
+      </w:r>
+      <w:proofErr w:type="spellEnd"/>
+      <w:r>
+        <w:t xml:space="preserve"> </w:t>
+      </w:r>
+      <w:proofErr w:type="spellStart"/>
+      <w:r>
+        <w:t>kinemtaic</w:t>
+      </w:r>
+      <w:proofErr w:type="spellEnd"/>
+      <w:r>
+        <w:t xml:space="preserve"> </w:t>
+      </w:r>
+      <w:proofErr w:type="spellStart"/>
+      <w:r>
+        <w:t>tree</w:t>
+      </w:r>
+      <w:proofErr w:type="spellEnd"/>
+      <w:r>
+        <w:t xml:space="preserve">) </w:t>
+      </w:r>
+      <w:proofErr w:type="spellStart"/>
+      <w:r>
+        <w:t>RobotLink</w:t>
+      </w:r>
+      <w:proofErr w:type="spellEnd"/>
+      <w:r>
+        <w:t xml:space="preserve"> </w:t>
+      </w:r>
+      <w:proofErr w:type="spellStart"/>
+      <w:r>
+        <w:t>methode</w:t>
+      </w:r>
+      <w:proofErr w:type="spellEnd"/>
+      <w:r>
+        <w:t xml:space="preserve"> siehe </w:t>
+      </w:r>
+      <w:proofErr w:type="spellStart"/>
+      <w:r>
+        <w:t>openAIgymNLinkcontinous</w:t>
+      </w:r>
+      <w:proofErr w:type="spellEnd"/>
+      <w:r>
+        <w:t xml:space="preserve">; </w:t>
       </w:r>
       <w:r>
         <w:rPr>
           <w:b/>
           <w:bCs/>
         </w:rPr>
-        <w:t>geht das nur für serielle roboter?</w:t>
-      </w:r>
-      <w:r>
-        <w:t xml:space="preserve"> Wir wussten nich wie man mehrere seperate Links machen kann an Körper </w:t>
-      </w:r>
-    </w:p>
-    <w:p/>
-    <w:p>
-      <w:r>
-        <w:t xml:space="preserve">Parents liste für die Links, noch nicht ganz verstanden -1,0,1… 4  haben keinen richtigen parent sind Node freiheitsgrade; 5er sind Hüfte, haben als Parent den Body, Unterschenkel wieder jeder ein anderen parent deswegen unterschiedlichee </w:t>
-      </w:r>
-    </w:p>
-    <w:p>
-      <w:r>
-        <w:t xml:space="preserve">Platform index 5 weil das ist der parent </w:t>
+        <w:t xml:space="preserve">geht das nur für serielle </w:t>
+      </w:r>
+      <w:proofErr w:type="spellStart"/>
+      <w:r>
+        <w:rPr>
+          <w:b/>
+          <w:bCs/>
+        </w:rPr>
+        <w:t>roboter</w:t>
+      </w:r>
+      <w:proofErr w:type="spellEnd"/>
+      <w:r>
+        <w:rPr>
+          <w:b/>
+          <w:bCs/>
+        </w:rPr>
+        <w:t>?</w:t>
+      </w:r>
+      <w:r>
+        <w:t xml:space="preserve"> Wir wussten nich wie man mehrere </w:t>
+      </w:r>
+      <w:proofErr w:type="spellStart"/>
+      <w:r>
+        <w:t>seperate</w:t>
+      </w:r>
+      <w:proofErr w:type="spellEnd"/>
+      <w:r>
+        <w:t xml:space="preserve"> Links machen kann an Körper </w:t>
+      </w:r>
+    </w:p>
+    <w:p/>
+    <w:p>
+      <w:r>
+        <w:t xml:space="preserve">Parents liste für die Links, noch nicht ganz verstanden -1,0,1… </w:t>
+      </w:r>
+      <w:proofErr w:type="gramStart"/>
+      <w:r>
+        <w:t>4  haben</w:t>
+      </w:r>
+      <w:proofErr w:type="gramEnd"/>
+      <w:r>
+        <w:t xml:space="preserve"> keinen richtigen </w:t>
+      </w:r>
+      <w:proofErr w:type="spellStart"/>
+      <w:r>
+        <w:t>parent</w:t>
+      </w:r>
+      <w:proofErr w:type="spellEnd"/>
+      <w:r>
+        <w:t xml:space="preserve"> sind Node </w:t>
+      </w:r>
+      <w:proofErr w:type="spellStart"/>
+      <w:r>
+        <w:t>freiheitsgrade</w:t>
+      </w:r>
+      <w:proofErr w:type="spellEnd"/>
+      <w:r>
+        <w:t xml:space="preserve">; 5er sind Hüfte, haben als Parent den Body, Unterschenkel wieder jeder ein anderen </w:t>
+      </w:r>
+      <w:proofErr w:type="spellStart"/>
+      <w:r>
+        <w:t>parent</w:t>
+      </w:r>
+      <w:proofErr w:type="spellEnd"/>
+      <w:r>
+        <w:t xml:space="preserve"> deswegen </w:t>
+      </w:r>
+      <w:proofErr w:type="spellStart"/>
+      <w:r>
+        <w:t>unterschiedlichee</w:t>
+      </w:r>
+      <w:proofErr w:type="spellEnd"/>
+      <w:r>
+        <w:t xml:space="preserve"> </w:t>
+      </w:r>
+    </w:p>
+    <w:p>
+      <w:proofErr w:type="spellStart"/>
+      <w:r>
+        <w:t>Platform</w:t>
+      </w:r>
+      <w:proofErr w:type="spellEnd"/>
+      <w:r>
+        <w:t xml:space="preserve"> </w:t>
+      </w:r>
+      <w:proofErr w:type="spellStart"/>
+      <w:r>
+        <w:t>index</w:t>
+      </w:r>
+      <w:proofErr w:type="spellEnd"/>
+      <w:r>
+        <w:t xml:space="preserve"> </w:t>
+      </w:r>
+      <w:proofErr w:type="gramStart"/>
+      <w:r>
+        <w:t>5</w:t>
+      </w:r>
+      <w:proofErr w:type="gramEnd"/>
+      <w:r>
+        <w:t xml:space="preserve"> weil das ist der </w:t>
+      </w:r>
+      <w:proofErr w:type="spellStart"/>
+      <w:r>
+        <w:t>parent</w:t>
+      </w:r>
+      <w:proofErr w:type="spellEnd"/>
+      <w:r>
+        <w:t xml:space="preserve"> </w:t>
       </w:r>
     </w:p>
     <w:p/>
@@ -243,38 +889,142 @@
     </w:p>
     <w:p>
       <w:r>
-        <w:t>Anordnung beinen in hipPsition Z.175 links vorne beginnend</w:t>
-      </w:r>
-    </w:p>
-    <w:p/>
-    <w:p>
-      <w:r>
-        <w:t xml:space="preserve">Wenn die der nach der reihe angehängt werden folgen sie parents </w:t>
-      </w:r>
-    </w:p>
-    <w:p/>
-    <w:p>
-      <w:r>
-        <w:t xml:space="preserve">Z.260 Marker die Kontakt mit boden herstellen, undurchfallbare punkte </w:t>
-      </w:r>
-    </w:p>
-    <w:p>
-      <w:r>
-        <w:t xml:space="preserve">Knie und hüfte bekommen kugel herum, Hund läuft auf virtueller Kugel an allen Gelenken und unterem Rand body (man könnte nach oberen rand kugeln hinzufügen) </w:t>
-      </w:r>
-    </w:p>
-    <w:p/>
-    <w:p>
-      <w:r>
-        <w:t>Anfangswinkel mit initalAngles, Aber werden später wahrscheinlich über die Motorkonfiguration</w:t>
-      </w:r>
-      <w:r>
-        <w:t xml:space="preserve"> festgelegt, initalAngles ist kein Übergabeparameter</w:t>
-      </w:r>
-    </w:p>
-    <w:p>
-      <w:r>
-        <w:t xml:space="preserve">In der Funktion die wir nachbilden werden diese auch nicht übergeben? (Bei def differential ist nur platform pos entscheidend, </w:t>
+        <w:t xml:space="preserve">Anordnung beinen in </w:t>
+      </w:r>
+      <w:proofErr w:type="spellStart"/>
+      <w:r>
+        <w:t>hipPsition</w:t>
+      </w:r>
+      <w:proofErr w:type="spellEnd"/>
+      <w:r>
+        <w:t xml:space="preserve"> Z.175 links vorne beginnend</w:t>
+      </w:r>
+    </w:p>
+    <w:p/>
+    <w:p>
+      <w:r>
+        <w:t xml:space="preserve">Wenn die der nach der reihe angehängt werden folgen sie </w:t>
+      </w:r>
+      <w:proofErr w:type="spellStart"/>
+      <w:r>
+        <w:t>parents</w:t>
+      </w:r>
+      <w:proofErr w:type="spellEnd"/>
+      <w:r>
+        <w:t xml:space="preserve"> </w:t>
+      </w:r>
+    </w:p>
+    <w:p/>
+    <w:p>
+      <w:r>
+        <w:t xml:space="preserve">Z.260 Marker </w:t>
+      </w:r>
+      <w:proofErr w:type="gramStart"/>
+      <w:r>
+        <w:t>die Kontakt</w:t>
+      </w:r>
+      <w:proofErr w:type="gramEnd"/>
+      <w:r>
+        <w:t xml:space="preserve"> mit </w:t>
+      </w:r>
+      <w:proofErr w:type="spellStart"/>
+      <w:r>
+        <w:t>boden</w:t>
+      </w:r>
+      <w:proofErr w:type="spellEnd"/>
+      <w:r>
+        <w:t xml:space="preserve"> herstellen, </w:t>
+      </w:r>
+      <w:proofErr w:type="spellStart"/>
+      <w:r>
+        <w:t>undurchfallbare</w:t>
+      </w:r>
+      <w:proofErr w:type="spellEnd"/>
+      <w:r>
+        <w:t xml:space="preserve"> punkte </w:t>
+      </w:r>
+    </w:p>
+    <w:p>
+      <w:r>
+        <w:t xml:space="preserve">Knie und hüfte bekommen </w:t>
+      </w:r>
+      <w:proofErr w:type="spellStart"/>
+      <w:r>
+        <w:t>kugel</w:t>
+      </w:r>
+      <w:proofErr w:type="spellEnd"/>
+      <w:r>
+        <w:t xml:space="preserve"> herum, Hund läuft auf virtueller Kugel an allen Gelenken und unterem Rand </w:t>
+      </w:r>
+      <w:proofErr w:type="spellStart"/>
+      <w:r>
+        <w:t>body</w:t>
+      </w:r>
+      <w:proofErr w:type="spellEnd"/>
+      <w:r>
+        <w:t xml:space="preserve"> (man könnte nach oberen </w:t>
+      </w:r>
+      <w:proofErr w:type="spellStart"/>
+      <w:r>
+        <w:t>rand</w:t>
+      </w:r>
+      <w:proofErr w:type="spellEnd"/>
+      <w:r>
+        <w:t xml:space="preserve"> kugeln hinzufügen) </w:t>
+      </w:r>
+    </w:p>
+    <w:p/>
+    <w:p>
+      <w:r>
+        <w:t xml:space="preserve">Anfangswinkel mit </w:t>
+      </w:r>
+      <w:proofErr w:type="spellStart"/>
+      <w:r>
+        <w:t>initalAngles</w:t>
+      </w:r>
+      <w:proofErr w:type="spellEnd"/>
+      <w:r>
+        <w:t>, Aber werden später wahrscheinlich über die Motorkonfiguration</w:t>
+      </w:r>
+      <w:r>
+        <w:t xml:space="preserve"> festgelegt, </w:t>
+      </w:r>
+      <w:proofErr w:type="spellStart"/>
+      <w:r>
+        <w:t>initalAngles</w:t>
+      </w:r>
+      <w:proofErr w:type="spellEnd"/>
+      <w:r>
+        <w:t xml:space="preserve"> ist kein Übergabeparameter</w:t>
+      </w:r>
+    </w:p>
+    <w:p>
+      <w:r>
+        <w:t xml:space="preserve">In der Funktion die wir nachbilden werden diese auch nicht übergeben? (Bei </w:t>
+      </w:r>
+      <w:proofErr w:type="spellStart"/>
+      <w:r>
+        <w:t>def</w:t>
+      </w:r>
+      <w:proofErr w:type="spellEnd"/>
+      <w:r>
+        <w:t xml:space="preserve"> differential ist nur </w:t>
+      </w:r>
+      <w:proofErr w:type="spellStart"/>
+      <w:r>
+        <w:t>platform</w:t>
+      </w:r>
+      <w:proofErr w:type="spellEnd"/>
+      <w:r>
+        <w:t xml:space="preserve"> </w:t>
+      </w:r>
+      <w:proofErr w:type="spellStart"/>
+      <w:r>
+        <w:t>pos</w:t>
+      </w:r>
+      <w:proofErr w:type="spellEnd"/>
+      <w:r>
+        <w:t xml:space="preserve"> entscheidend, </w:t>
       </w:r>
       <w:r>
         <w:t>müssen wir schauen wie das dann bei uns ist</w:t>
@@ -283,19 +1033,83 @@
     <w:p/>
     <w:p>
       <w:r>
-        <w:t xml:space="preserve">Wenn wir auf reference coodinates übergeben würden wäre das Nullpunkt vom globalen System </w:t>
-      </w:r>
-    </w:p>
-    <w:p/>
-    <w:p/>
-    <w:p>
-      <w:r>
-        <w:t xml:space="preserve">Wenn zeit kann man probieren Steuerungsfunktion in die UF …wie funktioniert das dann? Siehe Z.214 folgende im anderen beispiel vl sollten wir auch noch sensoren hinzufügen </w:t>
-      </w:r>
-    </w:p>
-    <w:p>
-      <w:r>
-        <w:t xml:space="preserve">An allen Gelenken noch Sensoren festmachen: 1pro Gelenk+1 Plattform; direkt bei create Kinematic Tree-&gt; Jonas </w:t>
+        <w:t xml:space="preserve">Wenn wir auf </w:t>
+      </w:r>
+      <w:proofErr w:type="spellStart"/>
+      <w:r>
+        <w:t>reference</w:t>
+      </w:r>
+      <w:proofErr w:type="spellEnd"/>
+      <w:r>
+        <w:t xml:space="preserve"> </w:t>
+      </w:r>
+      <w:proofErr w:type="spellStart"/>
+      <w:r>
+        <w:t>coodinates</w:t>
+      </w:r>
+      <w:proofErr w:type="spellEnd"/>
+      <w:r>
+        <w:t xml:space="preserve"> übergeben würden wäre </w:t>
+      </w:r>
+      <w:proofErr w:type="gramStart"/>
+      <w:r>
+        <w:t>das Nullpunkt</w:t>
+      </w:r>
+      <w:proofErr w:type="gramEnd"/>
+      <w:r>
+        <w:t xml:space="preserve"> vom globalen System </w:t>
+      </w:r>
+    </w:p>
+    <w:p/>
+    <w:p/>
+    <w:p>
+      <w:r>
+        <w:t xml:space="preserve">Wenn zeit kann man probieren Steuerungsfunktion in die UF …wie funktioniert das dann? Siehe Z.214 folgende im anderen </w:t>
+      </w:r>
+      <w:proofErr w:type="spellStart"/>
+      <w:r>
+        <w:t>beispiel</w:t>
+      </w:r>
+      <w:proofErr w:type="spellEnd"/>
+      <w:r>
+        <w:t xml:space="preserve"> </w:t>
+      </w:r>
+      <w:proofErr w:type="spellStart"/>
+      <w:r>
+        <w:t>vl</w:t>
+      </w:r>
+      <w:proofErr w:type="spellEnd"/>
+      <w:r>
+        <w:t xml:space="preserve"> sollten wir auch noch </w:t>
+      </w:r>
+      <w:proofErr w:type="spellStart"/>
+      <w:r>
+        <w:t>sensoren</w:t>
+      </w:r>
+      <w:proofErr w:type="spellEnd"/>
+      <w:r>
+        <w:t xml:space="preserve"> hinzufügen </w:t>
+      </w:r>
+    </w:p>
+    <w:p>
+      <w:r>
+        <w:t xml:space="preserve">An allen Gelenken noch Sensoren festmachen: 1pro Gelenk+1 Plattform; direkt bei </w:t>
+      </w:r>
+      <w:proofErr w:type="spellStart"/>
+      <w:r>
+        <w:t>create</w:t>
+      </w:r>
+      <w:proofErr w:type="spellEnd"/>
+      <w:r>
+        <w:t xml:space="preserve"> </w:t>
+      </w:r>
+      <w:proofErr w:type="spellStart"/>
+      <w:r>
+        <w:t>Kinematic</w:t>
+      </w:r>
+      <w:proofErr w:type="spellEnd"/>
+      <w:r>
+        <w:t xml:space="preserve"> Tree-&gt; Jonas </w:t>
       </w:r>
       <w:r>
         <w:t>schaut sich das nochmal an</w:t>
@@ -319,31 +1133,131 @@
       </w:r>
     </w:p>
     <w:p>
+      <w:proofErr w:type="spellStart"/>
       <w:r>
         <w:lastRenderedPageBreak/>
-        <w:t>Hundmodell auf github funktioniert noch nicht (heißt spot), reward und so noch anpassen</w:t>
-      </w:r>
-    </w:p>
-    <w:p>
-      <w:r>
-        <w:t xml:space="preserve">Trainiern muss man sich überlegen wie man das angeht </w:t>
-      </w:r>
-    </w:p>
-    <w:p>
-      <w:r>
-        <w:t xml:space="preserve">3 mal trainieren mit random settings-&gt; aussagekräftiger </w:t>
-      </w:r>
-    </w:p>
-    <w:p>
-      <w:r>
-        <w:t>Tensorboard verwenden (ist auch in openAIGymNLinkcontinours das ist unser ausgangsmodell, Siehe zeile 46) Visualisierung des fortschrittes, so kann man mehrere Trainings vergleichen</w:t>
-      </w:r>
-    </w:p>
-    <w:p/>
-    <w:p/>
-    <w:p>
-      <w:r>
-        <w:t xml:space="preserve">Kontakte muss man optimieren (kann man visualiriseren in </w:t>
+        <w:t>Hundmodell</w:t>
+      </w:r>
+      <w:proofErr w:type="spellEnd"/>
+      <w:r>
+        <w:t xml:space="preserve"> auf </w:t>
+      </w:r>
+      <w:proofErr w:type="spellStart"/>
+      <w:r>
+        <w:t>github</w:t>
+      </w:r>
+      <w:proofErr w:type="spellEnd"/>
+      <w:r>
+        <w:t xml:space="preserve"> funktioniert noch nicht (heißt </w:t>
+      </w:r>
+      <w:proofErr w:type="spellStart"/>
+      <w:r>
+        <w:t>spot</w:t>
+      </w:r>
+      <w:proofErr w:type="spellEnd"/>
+      <w:r>
+        <w:t xml:space="preserve">), </w:t>
+      </w:r>
+      <w:proofErr w:type="spellStart"/>
+      <w:r>
+        <w:t>reward</w:t>
+      </w:r>
+      <w:proofErr w:type="spellEnd"/>
+      <w:r>
+        <w:t xml:space="preserve"> und so noch anpassen</w:t>
+      </w:r>
+    </w:p>
+    <w:p>
+      <w:proofErr w:type="spellStart"/>
+      <w:r>
+        <w:t>Trainiern</w:t>
+      </w:r>
+      <w:proofErr w:type="spellEnd"/>
+      <w:r>
+        <w:t xml:space="preserve"> muss man sich überlegen wie man das angeht </w:t>
+      </w:r>
+    </w:p>
+    <w:p>
+      <w:proofErr w:type="gramStart"/>
+      <w:r>
+        <w:t>3 mal</w:t>
+      </w:r>
+      <w:proofErr w:type="gramEnd"/>
+      <w:r>
+        <w:t xml:space="preserve"> trainieren mit </w:t>
+      </w:r>
+      <w:proofErr w:type="spellStart"/>
+      <w:r>
+        <w:t>random</w:t>
+      </w:r>
+      <w:proofErr w:type="spellEnd"/>
+      <w:r>
+        <w:t xml:space="preserve"> </w:t>
+      </w:r>
+      <w:proofErr w:type="spellStart"/>
+      <w:r>
+        <w:t>settings</w:t>
+      </w:r>
+      <w:proofErr w:type="spellEnd"/>
+      <w:r>
+        <w:t xml:space="preserve">-&gt; aussagekräftiger </w:t>
+      </w:r>
+    </w:p>
+    <w:p>
+      <w:proofErr w:type="spellStart"/>
+      <w:r>
+        <w:t>Tensorboard</w:t>
+      </w:r>
+      <w:proofErr w:type="spellEnd"/>
+      <w:r>
+        <w:t xml:space="preserve"> verwenden (ist auch in </w:t>
+      </w:r>
+      <w:proofErr w:type="spellStart"/>
+      <w:r>
+        <w:t>openAIGymNLinkcontinours</w:t>
+      </w:r>
+      <w:proofErr w:type="spellEnd"/>
+      <w:r>
+        <w:t xml:space="preserve"> das ist unser </w:t>
+      </w:r>
+      <w:proofErr w:type="spellStart"/>
+      <w:r>
+        <w:t>ausgangsmodell</w:t>
+      </w:r>
+      <w:proofErr w:type="spellEnd"/>
+      <w:r>
+        <w:t xml:space="preserve">, Siehe </w:t>
+      </w:r>
+      <w:proofErr w:type="spellStart"/>
+      <w:r>
+        <w:t>zeile</w:t>
+      </w:r>
+      <w:proofErr w:type="spellEnd"/>
+      <w:r>
+        <w:t xml:space="preserve"> 46) Visualisierung des </w:t>
+      </w:r>
+      <w:proofErr w:type="spellStart"/>
+      <w:r>
+        <w:t>fortschrittes</w:t>
+      </w:r>
+      <w:proofErr w:type="spellEnd"/>
+      <w:r>
+        <w:t>, so kann man mehrere Trainings vergleichen</w:t>
+      </w:r>
+    </w:p>
+    <w:p/>
+    <w:p/>
+    <w:p>
+      <w:r>
+        <w:t xml:space="preserve">Kontakte muss man optimieren (kann man </w:t>
+      </w:r>
+      <w:proofErr w:type="spellStart"/>
+      <w:r>
+        <w:t>visualiriseren</w:t>
+      </w:r>
+      <w:proofErr w:type="spellEnd"/>
+      <w:r>
+        <w:t xml:space="preserve"> in </w:t>
       </w:r>
     </w:p>
     <w:p>
@@ -351,42 +1265,177 @@
         <w:t xml:space="preserve">Außen auf die schultern legen </w:t>
       </w:r>
       <w:r>
-        <w:t xml:space="preserve">(Schlutern evtl. noch hizufügen) </w:t>
-      </w:r>
-    </w:p>
-    <w:p/>
-    <w:p/>
-    <w:p>
-      <w:r>
-        <w:t>Für beschleunigung rechnen: löserparameter bei kontakt entweder kleine Schritte (also gut schrittweite: genau genug aber auch stabil</w:t>
-      </w:r>
-    </w:p>
-    <w:p>
-      <w:r>
-        <w:t>Bei expliziten löser ist Kopplung von kleinen und großen Frequenzen sehr ineffizient, newton wird dann nicht mehr verwendet auch wenn oben eingeschalten, exu.DynamicSolverType</w:t>
-      </w:r>
-    </w:p>
-    <w:p>
-      <w:r>
-        <w:t xml:space="preserve">Schnelles training etwas wichtiger wie genauigkeit </w:t>
-      </w:r>
-    </w:p>
-    <w:p>
-      <w:r>
-        <w:t xml:space="preserve">General alpha könnte auch gehen </w:t>
-      </w:r>
-    </w:p>
-    <w:p/>
-    <w:p>
-      <w:r>
-        <w:t xml:space="preserve">Die discontious settings sind gefährlich aber könnten es schneller machen (später im versuch aber dann ausschalten) </w:t>
-      </w:r>
-    </w:p>
-    <w:p/>
-    <w:p/>
-    <w:p>
-      <w:r>
-        <w:t>Optimieren mit how to improve performance abschnitt über</w:t>
+        <w:t>(</w:t>
+      </w:r>
+      <w:proofErr w:type="spellStart"/>
+      <w:r>
+        <w:t>Schlutern</w:t>
+      </w:r>
+      <w:proofErr w:type="spellEnd"/>
+      <w:r>
+        <w:t xml:space="preserve"> evtl. noch </w:t>
+      </w:r>
+      <w:proofErr w:type="spellStart"/>
+      <w:r>
+        <w:t>hizufügen</w:t>
+      </w:r>
+      <w:proofErr w:type="spellEnd"/>
+      <w:r>
+        <w:t xml:space="preserve">) </w:t>
+      </w:r>
+    </w:p>
+    <w:p/>
+    <w:p/>
+    <w:p>
+      <w:r>
+        <w:t xml:space="preserve">Für </w:t>
+      </w:r>
+      <w:proofErr w:type="spellStart"/>
+      <w:r>
+        <w:t>beschleunigung</w:t>
+      </w:r>
+      <w:proofErr w:type="spellEnd"/>
+      <w:r>
+        <w:t xml:space="preserve"> rechnen: </w:t>
+      </w:r>
+      <w:proofErr w:type="spellStart"/>
+      <w:r>
+        <w:t>löserparameter</w:t>
+      </w:r>
+      <w:proofErr w:type="spellEnd"/>
+      <w:r>
+        <w:t xml:space="preserve"> bei kontakt entweder kleine Schritte (also gut </w:t>
+      </w:r>
+      <w:proofErr w:type="spellStart"/>
+      <w:r>
+        <w:t>schrittweite</w:t>
+      </w:r>
+      <w:proofErr w:type="spellEnd"/>
+      <w:r>
+        <w:t>: genau genug aber auch stabil</w:t>
+      </w:r>
+    </w:p>
+    <w:p>
+      <w:r>
+        <w:t xml:space="preserve">Bei expliziten </w:t>
+      </w:r>
+      <w:proofErr w:type="spellStart"/>
+      <w:r>
+        <w:t>löser</w:t>
+      </w:r>
+      <w:proofErr w:type="spellEnd"/>
+      <w:r>
+        <w:t xml:space="preserve"> ist Kopplung von kleinen und großen Frequenzen sehr ineffizient, </w:t>
+      </w:r>
+      <w:proofErr w:type="spellStart"/>
+      <w:r>
+        <w:t>newton</w:t>
+      </w:r>
+      <w:proofErr w:type="spellEnd"/>
+      <w:r>
+        <w:t xml:space="preserve"> wird dann nicht mehr verwendet auch wenn oben eingeschalten, </w:t>
+      </w:r>
+      <w:proofErr w:type="spellStart"/>
+      <w:proofErr w:type="gramStart"/>
+      <w:r>
+        <w:t>exu.DynamicSolverType</w:t>
+      </w:r>
+      <w:proofErr w:type="spellEnd"/>
+      <w:proofErr w:type="gramEnd"/>
+    </w:p>
+    <w:p>
+      <w:r>
+        <w:t xml:space="preserve">Schnelles </w:t>
+      </w:r>
+      <w:proofErr w:type="spellStart"/>
+      <w:r>
+        <w:t>training</w:t>
+      </w:r>
+      <w:proofErr w:type="spellEnd"/>
+      <w:r>
+        <w:t xml:space="preserve"> etwas wichtiger wie </w:t>
+      </w:r>
+      <w:proofErr w:type="spellStart"/>
+      <w:r>
+        <w:t>genauigkeit</w:t>
+      </w:r>
+      <w:proofErr w:type="spellEnd"/>
+      <w:r>
+        <w:t xml:space="preserve"> </w:t>
+      </w:r>
+    </w:p>
+    <w:p>
+      <w:r>
+        <w:t xml:space="preserve">General </w:t>
+      </w:r>
+      <w:proofErr w:type="spellStart"/>
+      <w:r>
+        <w:t>alpha</w:t>
+      </w:r>
+      <w:proofErr w:type="spellEnd"/>
+      <w:r>
+        <w:t xml:space="preserve"> könnte auch gehen </w:t>
+      </w:r>
+    </w:p>
+    <w:p/>
+    <w:p>
+      <w:r>
+        <w:t xml:space="preserve">Die </w:t>
+      </w:r>
+      <w:proofErr w:type="spellStart"/>
+      <w:r>
+        <w:t>discontious</w:t>
+      </w:r>
+      <w:proofErr w:type="spellEnd"/>
+      <w:r>
+        <w:t xml:space="preserve"> </w:t>
+      </w:r>
+      <w:proofErr w:type="spellStart"/>
+      <w:r>
+        <w:t>settings</w:t>
+      </w:r>
+      <w:proofErr w:type="spellEnd"/>
+      <w:r>
+        <w:t xml:space="preserve"> sind gefährlich aber könnten es schneller machen (später im versuch aber dann ausschalten) </w:t>
+      </w:r>
+    </w:p>
+    <w:p/>
+    <w:p/>
+    <w:p>
+      <w:r>
+        <w:t xml:space="preserve">Optimieren mit </w:t>
+      </w:r>
+      <w:proofErr w:type="spellStart"/>
+      <w:r>
+        <w:t>how</w:t>
+      </w:r>
+      <w:proofErr w:type="spellEnd"/>
+      <w:r>
+        <w:t xml:space="preserve"> </w:t>
+      </w:r>
+      <w:proofErr w:type="spellStart"/>
+      <w:r>
+        <w:t>to</w:t>
+      </w:r>
+      <w:proofErr w:type="spellEnd"/>
+      <w:r>
+        <w:t xml:space="preserve"> </w:t>
+      </w:r>
+      <w:proofErr w:type="spellStart"/>
+      <w:r>
+        <w:t>improve</w:t>
+      </w:r>
+      <w:proofErr w:type="spellEnd"/>
+      <w:r>
+        <w:t xml:space="preserve"> </w:t>
+      </w:r>
+      <w:proofErr w:type="spellStart"/>
+      <w:r>
+        <w:t>performance</w:t>
+      </w:r>
+      <w:proofErr w:type="spellEnd"/>
+      <w:r>
+        <w:t xml:space="preserve"> abschnitt über</w:t>
       </w:r>
       <w:r>
         <w:t xml:space="preserve"> den wir schonmal gesprochen haben</w:t>
@@ -413,7 +1462,84 @@
         </w:numPr>
       </w:pPr>
       <w:r>
-        <w:t xml:space="preserve">Wenn parameter verändern, renderer ausschalten und auf kurze zeit ausprobieren(tEnd=1, stepSzie= 0.00002 ( ist dann für numberofsteps=int(tend/stepsize))) </w:t>
+        <w:t xml:space="preserve">Wenn </w:t>
+      </w:r>
+      <w:proofErr w:type="spellStart"/>
+      <w:r>
+        <w:t>parameter</w:t>
+      </w:r>
+      <w:proofErr w:type="spellEnd"/>
+      <w:r>
+        <w:t xml:space="preserve"> verändern, </w:t>
+      </w:r>
+      <w:proofErr w:type="spellStart"/>
+      <w:r>
+        <w:t>renderer</w:t>
+      </w:r>
+      <w:proofErr w:type="spellEnd"/>
+      <w:r>
+        <w:t xml:space="preserve"> ausschalten und auf kurze zeit </w:t>
+      </w:r>
+      <w:proofErr w:type="gramStart"/>
+      <w:r>
+        <w:t>ausprobieren(</w:t>
+      </w:r>
+      <w:proofErr w:type="spellStart"/>
+      <w:proofErr w:type="gramEnd"/>
+      <w:r>
+        <w:t>tEnd</w:t>
+      </w:r>
+      <w:proofErr w:type="spellEnd"/>
+      <w:r>
+        <w:t xml:space="preserve">=1, </w:t>
+      </w:r>
+      <w:proofErr w:type="spellStart"/>
+      <w:r>
+        <w:t>stepSzie</w:t>
+      </w:r>
+      <w:proofErr w:type="spellEnd"/>
+      <w:r>
+        <w:t xml:space="preserve">= 0.00002 </w:t>
+      </w:r>
+      <w:proofErr w:type="gramStart"/>
+      <w:r>
+        <w:t>( ist</w:t>
+      </w:r>
+      <w:proofErr w:type="gramEnd"/>
+      <w:r>
+        <w:t xml:space="preserve"> dann für </w:t>
+      </w:r>
+      <w:proofErr w:type="spellStart"/>
+      <w:r>
+        <w:t>numberofsteps</w:t>
+      </w:r>
+      <w:proofErr w:type="spellEnd"/>
+      <w:r>
+        <w:t>=</w:t>
+      </w:r>
+      <w:proofErr w:type="spellStart"/>
+      <w:r>
+        <w:t>int</w:t>
+      </w:r>
+      <w:proofErr w:type="spellEnd"/>
+      <w:r>
+        <w:t>(</w:t>
+      </w:r>
+      <w:proofErr w:type="spellStart"/>
+      <w:r>
+        <w:t>tend</w:t>
+      </w:r>
+      <w:proofErr w:type="spellEnd"/>
+      <w:r>
+        <w:t>/</w:t>
+      </w:r>
+      <w:proofErr w:type="spellStart"/>
+      <w:r>
+        <w:t>stepsize</w:t>
+      </w:r>
+      <w:proofErr w:type="spellEnd"/>
+      <w:r>
+        <w:t xml:space="preserve">))) </w:t>
       </w:r>
     </w:p>
     <w:p>
@@ -425,7 +1551,35 @@
         </w:numPr>
       </w:pPr>
       <w:r>
-        <w:t>Wo kommen python user functions vor, auch gr</w:t>
+        <w:t xml:space="preserve">Wo kommen </w:t>
+      </w:r>
+      <w:proofErr w:type="spellStart"/>
+      <w:r>
+        <w:t>python</w:t>
+      </w:r>
+      <w:proofErr w:type="spellEnd"/>
+      <w:r>
+        <w:t xml:space="preserve"> </w:t>
+      </w:r>
+      <w:proofErr w:type="spellStart"/>
+      <w:r>
+        <w:t>user</w:t>
+      </w:r>
+      <w:proofErr w:type="spellEnd"/>
+      <w:r>
+        <w:t xml:space="preserve"> </w:t>
+      </w:r>
+      <w:proofErr w:type="spellStart"/>
+      <w:r>
+        <w:t>functions</w:t>
+      </w:r>
+      <w:proofErr w:type="spellEnd"/>
+      <w:r>
+        <w:t xml:space="preserve"> vor, auch </w:t>
+      </w:r>
+      <w:proofErr w:type="spellStart"/>
+      <w:r>
+        <w:t>gr</w:t>
       </w:r>
       <w:r>
         <w:t>o</w:t>
@@ -436,6 +1590,7 @@
       <w:r>
         <w:t>rr</w:t>
       </w:r>
+      <w:proofErr w:type="spellEnd"/>
       <w:r>
         <w:t xml:space="preserve"> Bremser </w:t>
       </w:r>
@@ -443,24 +1598,63 @@
     <w:p/>
     <w:p>
       <w:r>
-        <w:t xml:space="preserve">In Spot beispiel: </w:t>
-      </w:r>
-    </w:p>
-    <w:p>
+        <w:t xml:space="preserve">In Spot </w:t>
+      </w:r>
+      <w:proofErr w:type="spellStart"/>
+      <w:r>
+        <w:t>beispiel</w:t>
+      </w:r>
+      <w:proofErr w:type="spellEnd"/>
+      <w:r>
+        <w:t xml:space="preserve">: </w:t>
+      </w:r>
+    </w:p>
+    <w:p>
+      <w:proofErr w:type="spellStart"/>
       <w:r>
         <w:t>Prestepu</w:t>
       </w:r>
       <w:r>
         <w:t>f</w:t>
       </w:r>
-      <w:r>
-        <w:t xml:space="preserve"> /callback </w:t>
-      </w:r>
-      <w:r>
-        <w:t>setzt Lasten, Trajektorienplanung</w:t>
-      </w:r>
-      <w:r>
-        <w:t xml:space="preserve"> (nur um zu sehen ob die Bewegung so ist wie ich möchte siehe zeile 244ff; rl findet das dann selbst heraus) nur zum Testen! Nicht zum Trainieren </w:t>
+      <w:proofErr w:type="spellEnd"/>
+      <w:r>
+        <w:t xml:space="preserve"> /</w:t>
+      </w:r>
+      <w:proofErr w:type="spellStart"/>
+      <w:r>
+        <w:t>callback</w:t>
+      </w:r>
+      <w:proofErr w:type="spellEnd"/>
+      <w:r>
+        <w:t xml:space="preserve"> </w:t>
+      </w:r>
+      <w:r>
+        <w:t xml:space="preserve">setzt Lasten, </w:t>
+      </w:r>
+      <w:proofErr w:type="spellStart"/>
+      <w:r>
+        <w:t>Trajektorienplanung</w:t>
+      </w:r>
+      <w:proofErr w:type="spellEnd"/>
+      <w:r>
+        <w:t xml:space="preserve"> (nur um zu sehen ob die Bewegung so ist wie ich möchte siehe </w:t>
+      </w:r>
+      <w:proofErr w:type="spellStart"/>
+      <w:r>
+        <w:t>zeile</w:t>
+      </w:r>
+      <w:proofErr w:type="spellEnd"/>
+      <w:r>
+        <w:t xml:space="preserve"> 244ff; </w:t>
+      </w:r>
+      <w:proofErr w:type="spellStart"/>
+      <w:r>
+        <w:t>rl</w:t>
+      </w:r>
+      <w:proofErr w:type="spellEnd"/>
+      <w:r>
+        <w:t xml:space="preserve"> findet das dann selbst heraus) nur zum Testen! Nicht zum Trainieren </w:t>
       </w:r>
     </w:p>
     <w:p/>
@@ -468,39 +1662,188 @@
     <w:p>
       <w:r>
         <w:lastRenderedPageBreak/>
-        <w:t xml:space="preserve">Schulter fehlt ein Gelenk(rauskippen) also schulter 2 Fg, Knie 1FG (bei den drei dehungen kann die mittlerere also y zu singularität führen, das sollte nicht die achse sein die sich mehr als 180Grad dreht; ist bei uns aber auch nicht) </w:t>
-      </w:r>
-    </w:p>
-    <w:p/>
-    <w:p>
-      <w:r>
-        <w:t>Im RL schlägt agent bewegung vor</w:t>
-      </w:r>
-    </w:p>
-    <w:p>
-      <w:r>
-        <w:t>Wir geben aktuelle stellungen aus kinematic tree getNodeoutput (und vl geschw.) 18 kann ich messen</w:t>
-      </w:r>
-    </w:p>
-    <w:p>
-      <w:r>
-        <w:t>Action nur die 12 ansteuerbaren koordinaten (nicht die ersten 6. Starrkörper)</w:t>
-      </w:r>
-    </w:p>
-    <w:p/>
-    <w:p>
-      <w:r>
-        <w:t xml:space="preserve">Wie setze ich reward? </w:t>
-      </w:r>
-    </w:p>
-    <w:p>
-      <w:r>
-        <w:t xml:space="preserve">Erst mit einfachen bewegungen starten (zb niederlegen) </w:t>
-      </w:r>
-    </w:p>
-    <w:p>
-      <w:r>
-        <w:t>Vl doch nicht aus dem fliegen starten? Da ist schwierig</w:t>
+        <w:t xml:space="preserve">Schulter fehlt ein Gelenk(rauskippen) also </w:t>
+      </w:r>
+      <w:proofErr w:type="spellStart"/>
+      <w:r>
+        <w:t>schulter</w:t>
+      </w:r>
+      <w:proofErr w:type="spellEnd"/>
+      <w:r>
+        <w:t xml:space="preserve"> 2 </w:t>
+      </w:r>
+      <w:proofErr w:type="spellStart"/>
+      <w:r>
+        <w:t>Fg</w:t>
+      </w:r>
+      <w:proofErr w:type="spellEnd"/>
+      <w:r>
+        <w:t xml:space="preserve">, Knie 1FG (bei den drei </w:t>
+      </w:r>
+      <w:proofErr w:type="spellStart"/>
+      <w:r>
+        <w:t>dehungen</w:t>
+      </w:r>
+      <w:proofErr w:type="spellEnd"/>
+      <w:r>
+        <w:t xml:space="preserve"> kann die </w:t>
+      </w:r>
+      <w:proofErr w:type="spellStart"/>
+      <w:r>
+        <w:t>mittlerere</w:t>
+      </w:r>
+      <w:proofErr w:type="spellEnd"/>
+      <w:r>
+        <w:t xml:space="preserve"> also y zu </w:t>
+      </w:r>
+      <w:proofErr w:type="spellStart"/>
+      <w:r>
+        <w:t>singularität</w:t>
+      </w:r>
+      <w:proofErr w:type="spellEnd"/>
+      <w:r>
+        <w:t xml:space="preserve"> führen, das sollte nicht die </w:t>
+      </w:r>
+      <w:proofErr w:type="spellStart"/>
+      <w:r>
+        <w:t>achse</w:t>
+      </w:r>
+      <w:proofErr w:type="spellEnd"/>
+      <w:r>
+        <w:t xml:space="preserve"> sein die sich mehr als 180Grad dreht; ist bei uns aber auch nicht) </w:t>
+      </w:r>
+    </w:p>
+    <w:p/>
+    <w:p>
+      <w:r>
+        <w:t xml:space="preserve">Im RL schlägt </w:t>
+      </w:r>
+      <w:proofErr w:type="spellStart"/>
+      <w:r>
+        <w:t>agent</w:t>
+      </w:r>
+      <w:proofErr w:type="spellEnd"/>
+      <w:r>
+        <w:t xml:space="preserve"> </w:t>
+      </w:r>
+      <w:proofErr w:type="spellStart"/>
+      <w:r>
+        <w:t>bewegung</w:t>
+      </w:r>
+      <w:proofErr w:type="spellEnd"/>
+      <w:r>
+        <w:t xml:space="preserve"> vor</w:t>
+      </w:r>
+    </w:p>
+    <w:p>
+      <w:r>
+        <w:t xml:space="preserve">Wir geben aktuelle </w:t>
+      </w:r>
+      <w:proofErr w:type="spellStart"/>
+      <w:r>
+        <w:t>stellungen</w:t>
+      </w:r>
+      <w:proofErr w:type="spellEnd"/>
+      <w:r>
+        <w:t xml:space="preserve"> aus </w:t>
+      </w:r>
+      <w:proofErr w:type="spellStart"/>
+      <w:r>
+        <w:t>kinematic</w:t>
+      </w:r>
+      <w:proofErr w:type="spellEnd"/>
+      <w:r>
+        <w:t xml:space="preserve"> </w:t>
+      </w:r>
+      <w:proofErr w:type="spellStart"/>
+      <w:r>
+        <w:t>tree</w:t>
+      </w:r>
+      <w:proofErr w:type="spellEnd"/>
+      <w:r>
+        <w:t xml:space="preserve"> </w:t>
+      </w:r>
+      <w:proofErr w:type="spellStart"/>
+      <w:r>
+        <w:t>getNodeoutput</w:t>
+      </w:r>
+      <w:proofErr w:type="spellEnd"/>
+      <w:r>
+        <w:t xml:space="preserve"> (und </w:t>
+      </w:r>
+      <w:proofErr w:type="spellStart"/>
+      <w:r>
+        <w:t>vl</w:t>
+      </w:r>
+      <w:proofErr w:type="spellEnd"/>
+      <w:r>
+        <w:t xml:space="preserve"> </w:t>
+      </w:r>
+      <w:proofErr w:type="spellStart"/>
+      <w:r>
+        <w:t>geschw</w:t>
+      </w:r>
+      <w:proofErr w:type="spellEnd"/>
+      <w:r>
+        <w:t>.) 18 kann ich messen</w:t>
+      </w:r>
+    </w:p>
+    <w:p>
+      <w:r>
+        <w:t xml:space="preserve">Action nur die 12 ansteuerbaren </w:t>
+      </w:r>
+      <w:proofErr w:type="spellStart"/>
+      <w:r>
+        <w:t>koordinaten</w:t>
+      </w:r>
+      <w:proofErr w:type="spellEnd"/>
+      <w:r>
+        <w:t xml:space="preserve"> (nicht die ersten 6. Starrkörper)</w:t>
+      </w:r>
+    </w:p>
+    <w:p/>
+    <w:p>
+      <w:r>
+        <w:t xml:space="preserve">Wie setze ich </w:t>
+      </w:r>
+      <w:proofErr w:type="spellStart"/>
+      <w:r>
+        <w:t>reward</w:t>
+      </w:r>
+      <w:proofErr w:type="spellEnd"/>
+      <w:r>
+        <w:t xml:space="preserve">? </w:t>
+      </w:r>
+    </w:p>
+    <w:p>
+      <w:r>
+        <w:t xml:space="preserve">Erst mit einfachen </w:t>
+      </w:r>
+      <w:proofErr w:type="spellStart"/>
+      <w:r>
+        <w:t>bewegungen</w:t>
+      </w:r>
+      <w:proofErr w:type="spellEnd"/>
+      <w:r>
+        <w:t xml:space="preserve"> starten (</w:t>
+      </w:r>
+      <w:proofErr w:type="spellStart"/>
+      <w:r>
+        <w:t>zb</w:t>
+      </w:r>
+      <w:proofErr w:type="spellEnd"/>
+      <w:r>
+        <w:t xml:space="preserve"> niederlegen) </w:t>
+      </w:r>
+    </w:p>
+    <w:p>
+      <w:proofErr w:type="spellStart"/>
+      <w:r>
+        <w:t>Vl</w:t>
+      </w:r>
+      <w:proofErr w:type="spellEnd"/>
+      <w:r>
+        <w:t xml:space="preserve"> doch nicht aus dem fliegen starten? Da ist schwierig</w:t>
       </w:r>
     </w:p>
     <w:p/>
@@ -518,7 +1861,15 @@
         </w:numPr>
       </w:pPr>
       <w:r>
-        <w:t xml:space="preserve"> Trajektorienplanung übernehmen</w:t>
+        <w:t xml:space="preserve"> </w:t>
+      </w:r>
+      <w:proofErr w:type="spellStart"/>
+      <w:r>
+        <w:t>Trajektorienplanung</w:t>
+      </w:r>
+      <w:proofErr w:type="spellEnd"/>
+      <w:r>
+        <w:t xml:space="preserve"> übernehmen</w:t>
       </w:r>
     </w:p>
     <w:p>
@@ -529,8 +1880,13 @@
           <w:numId w:val="1"/>
         </w:numPr>
       </w:pPr>
-      <w:r>
-        <w:t>Seitwärts Freiheitsgrad einbauen Schulter</w:t>
+      <w:proofErr w:type="gramStart"/>
+      <w:r>
+        <w:t>Seitwärts Freiheitsgrad</w:t>
+      </w:r>
+      <w:proofErr w:type="gramEnd"/>
+      <w:r>
+        <w:t xml:space="preserve"> einbauen Schulter</w:t>
       </w:r>
     </w:p>
     <w:p>
@@ -542,7 +1898,15 @@
         </w:numPr>
       </w:pPr>
       <w:r>
-        <w:t xml:space="preserve">Trägheitsparameter anpassen (vl. Steifigkeitsparameter zu hoch?) </w:t>
+        <w:t>Trägheitsparameter anpassen (</w:t>
+      </w:r>
+      <w:proofErr w:type="spellStart"/>
+      <w:r>
+        <w:t>vl</w:t>
+      </w:r>
+      <w:proofErr w:type="spellEnd"/>
+      <w:r>
+        <w:t xml:space="preserve">. Steifigkeitsparameter zu hoch?) </w:t>
       </w:r>
     </w:p>
     <w:p>
@@ -566,7 +1930,23 @@
         </w:numPr>
       </w:pPr>
       <w:r>
-        <w:t>Dann in Bsp schauen wie Reward gemacht wurde und das für einfache Bewegung umsetzen</w:t>
+        <w:t xml:space="preserve">Dann in </w:t>
+      </w:r>
+      <w:proofErr w:type="spellStart"/>
+      <w:r>
+        <w:t>Bsp</w:t>
+      </w:r>
+      <w:proofErr w:type="spellEnd"/>
+      <w:r>
+        <w:t xml:space="preserve"> schauen wie </w:t>
+      </w:r>
+      <w:proofErr w:type="spellStart"/>
+      <w:r>
+        <w:t>Reward</w:t>
+      </w:r>
+      <w:proofErr w:type="spellEnd"/>
+      <w:r>
+        <w:t xml:space="preserve"> gemacht wurde und das für einfache Bewegung umsetzen</w:t>
       </w:r>
     </w:p>
     <w:p/>
@@ -578,12 +1958,21 @@
           <w:bCs/>
         </w:rPr>
       </w:pPr>
+      <w:proofErr w:type="spellStart"/>
       <w:r>
         <w:rPr>
           <w:b/>
           <w:bCs/>
         </w:rPr>
-        <w:t>Teammeting 15.12.202</w:t>
+        <w:t>Teammeting</w:t>
+      </w:r>
+      <w:proofErr w:type="spellEnd"/>
+      <w:r>
+        <w:rPr>
+          <w:b/>
+          <w:bCs/>
+        </w:rPr>
+        <w:t xml:space="preserve"> 15.12.202</w:t>
       </w:r>
     </w:p>
     <w:p/>
@@ -601,7 +1990,39 @@
         </w:numPr>
       </w:pPr>
       <w:r>
-        <w:t xml:space="preserve">Wir übernehmen simple ground und weitere Features aus spot model um rechenffektiveren Kontaktfläche zu bekommen </w:t>
+        <w:t xml:space="preserve">Wir übernehmen simple </w:t>
+      </w:r>
+      <w:proofErr w:type="spellStart"/>
+      <w:r>
+        <w:t>ground</w:t>
+      </w:r>
+      <w:proofErr w:type="spellEnd"/>
+      <w:r>
+        <w:t xml:space="preserve"> und weitere Features aus </w:t>
+      </w:r>
+      <w:proofErr w:type="spellStart"/>
+      <w:r>
+        <w:t>spot</w:t>
+      </w:r>
+      <w:proofErr w:type="spellEnd"/>
+      <w:r>
+        <w:t xml:space="preserve"> </w:t>
+      </w:r>
+      <w:proofErr w:type="spellStart"/>
+      <w:r>
+        <w:t>model</w:t>
+      </w:r>
+      <w:proofErr w:type="spellEnd"/>
+      <w:r>
+        <w:t xml:space="preserve"> um </w:t>
+      </w:r>
+      <w:proofErr w:type="spellStart"/>
+      <w:r>
+        <w:t>rechenffektiveren</w:t>
+      </w:r>
+      <w:proofErr w:type="spellEnd"/>
+      <w:r>
+        <w:t xml:space="preserve"> Kontaktfläche zu bekommen </w:t>
       </w:r>
     </w:p>
     <w:p>
@@ -619,7 +2040,23 @@
     <w:p/>
     <w:p>
       <w:r>
-        <w:t xml:space="preserve">Schulter mit zwei zusätzlichen Freiheitsgraden und User Function entfernen anstatt dessen Trajektorieplanung übernehmen </w:t>
+        <w:t xml:space="preserve">Schulter mit zwei zusätzlichen Freiheitsgraden und User </w:t>
+      </w:r>
+      <w:proofErr w:type="spellStart"/>
+      <w:r>
+        <w:t>Function</w:t>
+      </w:r>
+      <w:proofErr w:type="spellEnd"/>
+      <w:r>
+        <w:t xml:space="preserve"> entfernen anstatt dessen </w:t>
+      </w:r>
+      <w:proofErr w:type="spellStart"/>
+      <w:r>
+        <w:t>Trajektorieplanung</w:t>
+      </w:r>
+      <w:proofErr w:type="spellEnd"/>
+      <w:r>
+        <w:t xml:space="preserve"> übernehmen </w:t>
       </w:r>
     </w:p>
     <w:p/>
@@ -641,20 +2078,84 @@
     </w:p>
     <w:p>
       <w:r>
-        <w:t xml:space="preserve">Für lernen: Lernschrittweite ist nicht gleich simulationsschrittweite (Lernen im millisekunden bereich) </w:t>
+        <w:t xml:space="preserve">Für lernen: Lernschrittweite ist nicht gleich simulationsschrittweite (Lernen im </w:t>
+      </w:r>
+      <w:proofErr w:type="spellStart"/>
+      <w:r>
+        <w:t>millisekunden</w:t>
+      </w:r>
+      <w:proofErr w:type="spellEnd"/>
+      <w:r>
+        <w:t xml:space="preserve"> </w:t>
+      </w:r>
+      <w:proofErr w:type="spellStart"/>
+      <w:r>
+        <w:t>bereich</w:t>
+      </w:r>
+      <w:proofErr w:type="spellEnd"/>
+      <w:r>
+        <w:t xml:space="preserve">) </w:t>
       </w:r>
     </w:p>
     <w:p>
       <w:r>
         <w:lastRenderedPageBreak/>
-        <w:t xml:space="preserve">Anfangen mit zum beispiel: beide beine gleich ansteuern (also statt 12 fg nur 6 weil beide beine gleich angesteuert werden) </w:t>
-      </w:r>
-    </w:p>
-    <w:p/>
-    <w:p/>
-    <w:p>
-      <w:r>
-        <w:t>Hund verändert durch bewegung seine eigenfrequenzen (bei der zeitintegration etwas konservativer damit sowas nicht auftritt so wie jetzt gerade)</w:t>
+        <w:t xml:space="preserve">Anfangen mit zum </w:t>
+      </w:r>
+      <w:proofErr w:type="spellStart"/>
+      <w:r>
+        <w:t>beispiel</w:t>
+      </w:r>
+      <w:proofErr w:type="spellEnd"/>
+      <w:r>
+        <w:t xml:space="preserve">: beide beine gleich ansteuern (also statt 12 </w:t>
+      </w:r>
+      <w:proofErr w:type="spellStart"/>
+      <w:r>
+        <w:t>fg</w:t>
+      </w:r>
+      <w:proofErr w:type="spellEnd"/>
+      <w:r>
+        <w:t xml:space="preserve"> nur </w:t>
+      </w:r>
+      <w:proofErr w:type="gramStart"/>
+      <w:r>
+        <w:t>6</w:t>
+      </w:r>
+      <w:proofErr w:type="gramEnd"/>
+      <w:r>
+        <w:t xml:space="preserve"> weil beide beine gleich angesteuert werden) </w:t>
+      </w:r>
+    </w:p>
+    <w:p/>
+    <w:p/>
+    <w:p>
+      <w:r>
+        <w:t xml:space="preserve">Hund verändert durch </w:t>
+      </w:r>
+      <w:proofErr w:type="spellStart"/>
+      <w:r>
+        <w:t>bewegung</w:t>
+      </w:r>
+      <w:proofErr w:type="spellEnd"/>
+      <w:r>
+        <w:t xml:space="preserve"> seine </w:t>
+      </w:r>
+      <w:proofErr w:type="spellStart"/>
+      <w:r>
+        <w:t>eigenfrequenzen</w:t>
+      </w:r>
+      <w:proofErr w:type="spellEnd"/>
+      <w:r>
+        <w:t xml:space="preserve"> (bei der </w:t>
+      </w:r>
+      <w:proofErr w:type="spellStart"/>
+      <w:r>
+        <w:t>zeitintegration</w:t>
+      </w:r>
+      <w:proofErr w:type="spellEnd"/>
+      <w:r>
+        <w:t xml:space="preserve"> etwas konservativer damit sowas nicht auftritt so wie jetzt gerade)</w:t>
       </w:r>
     </w:p>
     <w:p/>
@@ -680,8 +2181,13 @@
       </w:r>
     </w:p>
     <w:p>
-      <w:r>
-        <w:t xml:space="preserve">MapAction geändert -&gt; </w:t>
+      <w:proofErr w:type="spellStart"/>
+      <w:r>
+        <w:t>MapAction</w:t>
+      </w:r>
+      <w:proofErr w:type="spellEnd"/>
+      <w:r>
+        <w:t xml:space="preserve"> geändert -&gt; </w:t>
       </w:r>
     </w:p>
     <w:p>
@@ -690,21 +2196,47 @@
       </w:r>
     </w:p>
     <w:p>
-      <w:r>
-        <w:t>Rewards stimmen noch nicht so gut, wenn auf 300 000 Steps trainieren</w:t>
-      </w:r>
-    </w:p>
-    <w:p>
-      <w:r>
-        <w:t xml:space="preserve">Jonas neue getReward Funktion </w:t>
+      <w:proofErr w:type="spellStart"/>
+      <w:r>
+        <w:t>Rewards</w:t>
+      </w:r>
+      <w:proofErr w:type="spellEnd"/>
+      <w:r>
+        <w:t xml:space="preserve"> stimmen noch nicht so gut, wenn auf 300 000 </w:t>
+      </w:r>
+      <w:proofErr w:type="spellStart"/>
+      <w:r>
+        <w:t>Steps</w:t>
+      </w:r>
+      <w:proofErr w:type="spellEnd"/>
+      <w:r>
+        <w:t xml:space="preserve"> trainieren</w:t>
+      </w:r>
+    </w:p>
+    <w:p>
+      <w:r>
+        <w:t xml:space="preserve">Jonas neue </w:t>
+      </w:r>
+      <w:proofErr w:type="spellStart"/>
+      <w:r>
+        <w:t>getReward</w:t>
+      </w:r>
+      <w:proofErr w:type="spellEnd"/>
+      <w:r>
+        <w:t xml:space="preserve"> Funktion </w:t>
       </w:r>
       <w:r>
         <w:t xml:space="preserve">(belohnt </w:t>
       </w:r>
     </w:p>
     <w:p>
-      <w:r>
-        <w:t>vorwärtsbewegung -&gt; hier besser auf eine Zielgeschwindigkeit? Sonst läuft so schnell wie möglich/kippt nach vorne?</w:t>
+      <w:proofErr w:type="spellStart"/>
+      <w:r>
+        <w:t>vorwärtsbewegung</w:t>
+      </w:r>
+      <w:proofErr w:type="spellEnd"/>
+      <w:r>
+        <w:t xml:space="preserve"> -&gt; hier besser auf eine Zielgeschwindigkeit? Sonst läuft so schnell wie möglich/kippt nach vorne?</w:t>
       </w:r>
     </w:p>
     <w:p>
@@ -731,17 +2263,48 @@
       <w:r>
         <w:t xml:space="preserve">Habe in Z. 771 Render=False gestellt, damit es funktioniert, sonst immer Fehler: </w:t>
       </w:r>
-      <w:r>
-        <w:t>name 'SC' is not defined</w:t>
-      </w:r>
+      <w:proofErr w:type="spellStart"/>
+      <w:r>
+        <w:t>name</w:t>
+      </w:r>
+      <w:proofErr w:type="spellEnd"/>
+      <w:r>
+        <w:t xml:space="preserve"> 'SC' </w:t>
+      </w:r>
+      <w:proofErr w:type="spellStart"/>
+      <w:r>
+        <w:t>is</w:t>
+      </w:r>
+      <w:proofErr w:type="spellEnd"/>
+      <w:r>
+        <w:t xml:space="preserve"> not </w:t>
+      </w:r>
+      <w:proofErr w:type="spellStart"/>
+      <w:r>
+        <w:t>defined</w:t>
+      </w:r>
+      <w:proofErr w:type="spellEnd"/>
     </w:p>
     <w:p>
       <w:r>
         <w:t>Das ist ein Problem der Bibliothek</w:t>
       </w:r>
       <w:r>
-        <w:t>, wenn man in Der Testmodel() ganz unten vom Skript das SC jeweils zu self.SC ändert funktioniert rendering</w:t>
-      </w:r>
+        <w:t xml:space="preserve">, wenn man in Der </w:t>
+      </w:r>
+      <w:proofErr w:type="gramStart"/>
+      <w:r>
+        <w:t>Testmodel(</w:t>
+      </w:r>
+      <w:proofErr w:type="gramEnd"/>
+      <w:r>
+        <w:t xml:space="preserve">) ganz unten vom Skript das SC jeweils zu self.SC ändert funktioniert </w:t>
+      </w:r>
+      <w:proofErr w:type="spellStart"/>
+      <w:r>
+        <w:t>rendering</w:t>
+      </w:r>
+      <w:proofErr w:type="spellEnd"/>
     </w:p>
     <w:p/>
     <w:p>
@@ -752,7 +2315,15 @@
         <w:t>s</w:t>
       </w:r>
       <w:r>
-        <w:t xml:space="preserve">tmal versuchen auf etwas einfaches zu trainieren wie zb. Niederlegen? </w:t>
+        <w:t xml:space="preserve">tmal versuchen auf etwas einfaches zu trainieren wie </w:t>
+      </w:r>
+      <w:proofErr w:type="spellStart"/>
+      <w:r>
+        <w:t>zb</w:t>
+      </w:r>
+      <w:proofErr w:type="spellEnd"/>
+      <w:r>
+        <w:t xml:space="preserve">. Niederlegen? </w:t>
       </w:r>
       <w:r>
         <w:t>Ducken</w:t>
@@ -783,7 +2354,17 @@
     </w:p>
     <w:p>
       <w:r>
-        <w:t>Hüftwinkel zu kniewinkeln dazuadieren dass es ein angewinkeltes Knie ist</w:t>
+        <w:t xml:space="preserve">Hüftwinkel zu kniewinkeln </w:t>
+      </w:r>
+      <w:proofErr w:type="spellStart"/>
+      <w:proofErr w:type="gramStart"/>
+      <w:r>
+        <w:t>dazuadieren</w:t>
+      </w:r>
+      <w:proofErr w:type="spellEnd"/>
+      <w:proofErr w:type="gramEnd"/>
+      <w:r>
+        <w:t xml:space="preserve"> dass es ein angewinkeltes Knie ist</w:t>
       </w:r>
       <w:r>
         <w:t xml:space="preserve"> </w:t>
@@ -799,7 +2380,15 @@
     <w:p/>
     <w:p>
       <w:r>
-        <w:t xml:space="preserve">Man könnte ausprobieren In Mapaction </w:t>
+        <w:t xml:space="preserve">Man könnte ausprobieren In </w:t>
+      </w:r>
+      <w:proofErr w:type="spellStart"/>
+      <w:r>
+        <w:t>Mapaction</w:t>
+      </w:r>
+      <w:proofErr w:type="spellEnd"/>
+      <w:r>
+        <w:t xml:space="preserve"> </w:t>
       </w:r>
       <w:r>
         <w:t>B</w:t>
@@ -810,15 +2399,203 @@
     </w:p>
     <w:p>
       <w:r>
-        <w:t xml:space="preserve">Bewegung gibt action aus (die 8 winkel werden in mapaction geclipt, vl hat er grad zu viele möglichkeiten vl gut für observation state) , dazu vl implementierung spot mapaction auskommentiert if self.use incrementalset, schauen was da gemacht wird (hier sind winkel glaub ich anders angelegt von der Numerierung her) legsinit vl das immer zwei am Boden sein müssen? </w:t>
-      </w:r>
-      <w:r>
-        <w:t>Nein, legsinit ist nur die Startposition der füße</w:t>
-      </w:r>
-    </w:p>
-    <w:p>
-      <w:r>
-        <w:t xml:space="preserve">Notizen dazu: wir könnten auch dieses self.doPlanar = True setzen um die x-Hüftbewegung anfänglich zu sperren? </w:t>
+        <w:t xml:space="preserve">Bewegung gibt </w:t>
+      </w:r>
+      <w:proofErr w:type="spellStart"/>
+      <w:r>
+        <w:t>action</w:t>
+      </w:r>
+      <w:proofErr w:type="spellEnd"/>
+      <w:r>
+        <w:t xml:space="preserve"> aus (die 8 </w:t>
+      </w:r>
+      <w:proofErr w:type="spellStart"/>
+      <w:r>
+        <w:t>winkel</w:t>
+      </w:r>
+      <w:proofErr w:type="spellEnd"/>
+      <w:r>
+        <w:t xml:space="preserve"> werden in </w:t>
+      </w:r>
+      <w:proofErr w:type="spellStart"/>
+      <w:r>
+        <w:t>mapaction</w:t>
+      </w:r>
+      <w:proofErr w:type="spellEnd"/>
+      <w:r>
+        <w:t xml:space="preserve"> </w:t>
+      </w:r>
+      <w:proofErr w:type="spellStart"/>
+      <w:r>
+        <w:t>geclipt</w:t>
+      </w:r>
+      <w:proofErr w:type="spellEnd"/>
+      <w:r>
+        <w:t xml:space="preserve">, </w:t>
+      </w:r>
+      <w:proofErr w:type="spellStart"/>
+      <w:r>
+        <w:t>vl</w:t>
+      </w:r>
+      <w:proofErr w:type="spellEnd"/>
+      <w:r>
+        <w:t xml:space="preserve"> hat er grad zu viele </w:t>
+      </w:r>
+      <w:proofErr w:type="spellStart"/>
+      <w:r>
+        <w:t>möglichkeiten</w:t>
+      </w:r>
+      <w:proofErr w:type="spellEnd"/>
+      <w:r>
+        <w:t xml:space="preserve"> </w:t>
+      </w:r>
+      <w:proofErr w:type="spellStart"/>
+      <w:r>
+        <w:t>vl</w:t>
+      </w:r>
+      <w:proofErr w:type="spellEnd"/>
+      <w:r>
+        <w:t xml:space="preserve"> gut für </w:t>
+      </w:r>
+      <w:proofErr w:type="spellStart"/>
+      <w:r>
+        <w:t>observation</w:t>
+      </w:r>
+      <w:proofErr w:type="spellEnd"/>
+      <w:r>
+        <w:t xml:space="preserve"> </w:t>
+      </w:r>
+      <w:proofErr w:type="spellStart"/>
+      <w:r>
+        <w:t>state</w:t>
+      </w:r>
+      <w:proofErr w:type="spellEnd"/>
+      <w:proofErr w:type="gramStart"/>
+      <w:r>
+        <w:t>) ,</w:t>
+      </w:r>
+      <w:proofErr w:type="gramEnd"/>
+      <w:r>
+        <w:t xml:space="preserve"> dazu </w:t>
+      </w:r>
+      <w:proofErr w:type="spellStart"/>
+      <w:r>
+        <w:t>vl</w:t>
+      </w:r>
+      <w:proofErr w:type="spellEnd"/>
+      <w:r>
+        <w:t xml:space="preserve"> </w:t>
+      </w:r>
+      <w:proofErr w:type="spellStart"/>
+      <w:r>
+        <w:t>implementierung</w:t>
+      </w:r>
+      <w:proofErr w:type="spellEnd"/>
+      <w:r>
+        <w:t xml:space="preserve"> </w:t>
+      </w:r>
+      <w:proofErr w:type="spellStart"/>
+      <w:r>
+        <w:t>spot</w:t>
+      </w:r>
+      <w:proofErr w:type="spellEnd"/>
+      <w:r>
+        <w:t xml:space="preserve"> </w:t>
+      </w:r>
+      <w:proofErr w:type="spellStart"/>
+      <w:r>
+        <w:t>mapaction</w:t>
+      </w:r>
+      <w:proofErr w:type="spellEnd"/>
+      <w:r>
+        <w:t xml:space="preserve"> auskommentiert </w:t>
+      </w:r>
+      <w:proofErr w:type="spellStart"/>
+      <w:r>
+        <w:t>if</w:t>
+      </w:r>
+      <w:proofErr w:type="spellEnd"/>
+      <w:r>
+        <w:t xml:space="preserve"> </w:t>
+      </w:r>
+      <w:proofErr w:type="spellStart"/>
+      <w:r>
+        <w:t>self.use</w:t>
+      </w:r>
+      <w:proofErr w:type="spellEnd"/>
+      <w:r>
+        <w:t xml:space="preserve"> </w:t>
+      </w:r>
+      <w:proofErr w:type="spellStart"/>
+      <w:r>
+        <w:t>incrementalset</w:t>
+      </w:r>
+      <w:proofErr w:type="spellEnd"/>
+      <w:r>
+        <w:t xml:space="preserve">, schauen was da gemacht wird (hier sind </w:t>
+      </w:r>
+      <w:proofErr w:type="spellStart"/>
+      <w:r>
+        <w:t>winkel</w:t>
+      </w:r>
+      <w:proofErr w:type="spellEnd"/>
+      <w:r>
+        <w:t xml:space="preserve"> glaub ich anders angelegt von der </w:t>
+      </w:r>
+      <w:proofErr w:type="spellStart"/>
+      <w:r>
+        <w:t>Numerierung</w:t>
+      </w:r>
+      <w:proofErr w:type="spellEnd"/>
+      <w:r>
+        <w:t xml:space="preserve"> her) </w:t>
+      </w:r>
+      <w:proofErr w:type="spellStart"/>
+      <w:r>
+        <w:t>legsinit</w:t>
+      </w:r>
+      <w:proofErr w:type="spellEnd"/>
+      <w:r>
+        <w:t xml:space="preserve"> </w:t>
+      </w:r>
+      <w:proofErr w:type="spellStart"/>
+      <w:r>
+        <w:t>vl</w:t>
+      </w:r>
+      <w:proofErr w:type="spellEnd"/>
+      <w:r>
+        <w:t xml:space="preserve"> das immer zwei am Boden sein müssen? </w:t>
+      </w:r>
+      <w:r>
+        <w:t xml:space="preserve">Nein, </w:t>
+      </w:r>
+      <w:proofErr w:type="spellStart"/>
+      <w:r>
+        <w:t>legsinit</w:t>
+      </w:r>
+      <w:proofErr w:type="spellEnd"/>
+      <w:r>
+        <w:t xml:space="preserve"> ist nur die Startposition der </w:t>
+      </w:r>
+      <w:proofErr w:type="spellStart"/>
+      <w:r>
+        <w:t>füße</w:t>
+      </w:r>
+      <w:proofErr w:type="spellEnd"/>
+    </w:p>
+    <w:p>
+      <w:r>
+        <w:t xml:space="preserve">Notizen dazu: wir könnten auch dieses </w:t>
+      </w:r>
+      <w:proofErr w:type="spellStart"/>
+      <w:proofErr w:type="gramStart"/>
+      <w:r>
+        <w:t>self.doPlanar</w:t>
+      </w:r>
+      <w:proofErr w:type="spellEnd"/>
+      <w:proofErr w:type="gramEnd"/>
+      <w:r>
+        <w:t xml:space="preserve"> = True setzen um die x-Hüftbewegung anfänglich zu sperren? </w:t>
       </w:r>
     </w:p>
     <w:p>
@@ -835,54 +2612,164 @@
         </w:numPr>
       </w:pPr>
       <w:r>
-        <w:t>Klingt so als macht sinn auf unser beispiel zu übersetzen</w:t>
-      </w:r>
-    </w:p>
-    <w:p>
-      <w:pPr>
-        <w:rPr>
-          <w:lang w:val="en-US"/>
-        </w:rPr>
-      </w:pPr>
-      <w:r>
-        <w:rPr>
-          <w:lang w:val="en-US"/>
-        </w:rPr>
-        <w:t>Danach IncrementalSetValues für velocity co</w:t>
-      </w:r>
-      <w:r>
-        <w:rPr>
-          <w:lang w:val="en-US"/>
-        </w:rPr>
-        <w:t>ntrol</w:t>
-      </w:r>
-    </w:p>
-    <w:p>
-      <w:pPr>
-        <w:rPr>
-          <w:lang w:val="en-US"/>
-        </w:rPr>
-      </w:pPr>
-    </w:p>
-    <w:p>
-      <w:r>
-        <w:t>Was macht leg states genau? Warum mit 100 , vl mal rumspielen was das ausmacht</w:t>
-      </w:r>
-    </w:p>
-    <w:p>
-      <w:r>
-        <w:t>In Output2State andDone wird kontakt zu boden gemessen</w:t>
-      </w:r>
-    </w:p>
-    <w:p/>
-    <w:p>
-      <w:r>
-        <w:t xml:space="preserve">In zeile 340 geht aus dem Observation space gleich raus (entweder space zu klein oder winkel zu groß, </w:t>
-      </w:r>
-    </w:p>
-    <w:p>
-      <w:r>
-        <w:t>max vel. In z.191 mal mal drei</w:t>
+        <w:t xml:space="preserve">Klingt so als macht sinn auf unser </w:t>
+      </w:r>
+      <w:proofErr w:type="spellStart"/>
+      <w:r>
+        <w:t>beispiel</w:t>
+      </w:r>
+      <w:proofErr w:type="spellEnd"/>
+      <w:r>
+        <w:t xml:space="preserve"> zu übersetzen</w:t>
+      </w:r>
+    </w:p>
+    <w:p>
+      <w:r>
+        <w:t xml:space="preserve">Danach </w:t>
+      </w:r>
+      <w:proofErr w:type="spellStart"/>
+      <w:r>
+        <w:t>IncrementalSetValues</w:t>
+      </w:r>
+      <w:proofErr w:type="spellEnd"/>
+      <w:r>
+        <w:t xml:space="preserve"> für </w:t>
+      </w:r>
+      <w:proofErr w:type="spellStart"/>
+      <w:r>
+        <w:t>velocity</w:t>
+      </w:r>
+      <w:proofErr w:type="spellEnd"/>
+      <w:r>
+        <w:t xml:space="preserve"> </w:t>
+      </w:r>
+      <w:proofErr w:type="spellStart"/>
+      <w:r>
+        <w:t>control</w:t>
+      </w:r>
+      <w:proofErr w:type="spellEnd"/>
+    </w:p>
+    <w:p/>
+    <w:p>
+      <w:r>
+        <w:t xml:space="preserve">Was macht leg </w:t>
+      </w:r>
+      <w:proofErr w:type="spellStart"/>
+      <w:r>
+        <w:t>states</w:t>
+      </w:r>
+      <w:proofErr w:type="spellEnd"/>
+      <w:r>
+        <w:t xml:space="preserve"> genau? Warum mit </w:t>
+      </w:r>
+      <w:proofErr w:type="gramStart"/>
+      <w:r>
+        <w:t>100 ,</w:t>
+      </w:r>
+      <w:proofErr w:type="gramEnd"/>
+      <w:r>
+        <w:t xml:space="preserve"> </w:t>
+      </w:r>
+      <w:proofErr w:type="spellStart"/>
+      <w:r>
+        <w:t>vl</w:t>
+      </w:r>
+      <w:proofErr w:type="spellEnd"/>
+      <w:r>
+        <w:t xml:space="preserve"> mal rumspielen was das ausmacht</w:t>
+      </w:r>
+    </w:p>
+    <w:p>
+      <w:r>
+        <w:t xml:space="preserve">In Output2State </w:t>
+      </w:r>
+      <w:proofErr w:type="spellStart"/>
+      <w:r>
+        <w:t>andDone</w:t>
+      </w:r>
+      <w:proofErr w:type="spellEnd"/>
+      <w:r>
+        <w:t xml:space="preserve"> wird kontakt zu </w:t>
+      </w:r>
+      <w:proofErr w:type="spellStart"/>
+      <w:r>
+        <w:t>boden</w:t>
+      </w:r>
+      <w:proofErr w:type="spellEnd"/>
+      <w:r>
+        <w:t xml:space="preserve"> gemessen</w:t>
+      </w:r>
+    </w:p>
+    <w:p/>
+    <w:p>
+      <w:r>
+        <w:t xml:space="preserve">In </w:t>
+      </w:r>
+      <w:proofErr w:type="spellStart"/>
+      <w:r>
+        <w:t>zeile</w:t>
+      </w:r>
+      <w:proofErr w:type="spellEnd"/>
+      <w:r>
+        <w:t xml:space="preserve"> 340 geht aus dem Observation </w:t>
+      </w:r>
+      <w:proofErr w:type="spellStart"/>
+      <w:r>
+        <w:t>space</w:t>
+      </w:r>
+      <w:proofErr w:type="spellEnd"/>
+      <w:r>
+        <w:t xml:space="preserve"> gleich raus (entweder </w:t>
+      </w:r>
+      <w:proofErr w:type="spellStart"/>
+      <w:r>
+        <w:t>space</w:t>
+      </w:r>
+      <w:proofErr w:type="spellEnd"/>
+      <w:r>
+        <w:t xml:space="preserve"> zu klein oder </w:t>
+      </w:r>
+      <w:proofErr w:type="spellStart"/>
+      <w:r>
+        <w:t>winkel</w:t>
+      </w:r>
+      <w:proofErr w:type="spellEnd"/>
+      <w:r>
+        <w:t xml:space="preserve"> zu groß, </w:t>
+      </w:r>
+    </w:p>
+    <w:p>
+      <w:proofErr w:type="spellStart"/>
+      <w:r>
+        <w:t>max</w:t>
+      </w:r>
+      <w:proofErr w:type="spellEnd"/>
+      <w:r>
+        <w:t xml:space="preserve"> </w:t>
+      </w:r>
+      <w:proofErr w:type="spellStart"/>
+      <w:r>
+        <w:t>vel</w:t>
+      </w:r>
+      <w:proofErr w:type="spellEnd"/>
+      <w:r>
+        <w:t>. In z.</w:t>
+      </w:r>
+      <w:proofErr w:type="gramStart"/>
+      <w:r>
+        <w:t>191 mal</w:t>
+      </w:r>
+      <w:proofErr w:type="gramEnd"/>
+      <w:r>
+        <w:t xml:space="preserve"> </w:t>
+      </w:r>
+      <w:proofErr w:type="spellStart"/>
+      <w:r>
+        <w:t>mal</w:t>
+      </w:r>
+      <w:proofErr w:type="spellEnd"/>
+      <w:r>
+        <w:t xml:space="preserve"> drei</w:t>
       </w:r>
     </w:p>
     <w:p/>
@@ -902,20 +2789,46 @@
       </w:r>
     </w:p>
     <w:p>
-      <w:r>
-        <w:t xml:space="preserve">Reward könnte noch am ehesten falsch sein (oder halt das Modell selbst) </w:t>
-      </w:r>
-    </w:p>
-    <w:p/>
-    <w:p/>
-    <w:p>
-      <w:r>
-        <w:t xml:space="preserve">Gersti fragen </w:t>
-      </w:r>
-    </w:p>
-    <w:p>
-      <w:r>
-        <w:t xml:space="preserve">Wie reward logik am besten sodass nicht schiebt </w:t>
+      <w:proofErr w:type="spellStart"/>
+      <w:r>
+        <w:t>Reward</w:t>
+      </w:r>
+      <w:proofErr w:type="spellEnd"/>
+      <w:r>
+        <w:t xml:space="preserve"> könnte noch am ehesten falsch sein (oder halt das Modell selbst) </w:t>
+      </w:r>
+    </w:p>
+    <w:p/>
+    <w:p/>
+    <w:p>
+      <w:proofErr w:type="spellStart"/>
+      <w:r>
+        <w:t>Gersti</w:t>
+      </w:r>
+      <w:proofErr w:type="spellEnd"/>
+      <w:r>
+        <w:t xml:space="preserve"> fragen </w:t>
+      </w:r>
+    </w:p>
+    <w:p>
+      <w:r>
+        <w:t xml:space="preserve">Wie </w:t>
+      </w:r>
+      <w:proofErr w:type="spellStart"/>
+      <w:r>
+        <w:t>reward</w:t>
+      </w:r>
+      <w:proofErr w:type="spellEnd"/>
+      <w:r>
+        <w:t xml:space="preserve"> </w:t>
+      </w:r>
+      <w:proofErr w:type="spellStart"/>
+      <w:r>
+        <w:t>logik</w:t>
+      </w:r>
+      <w:proofErr w:type="spellEnd"/>
+      <w:r>
+        <w:t xml:space="preserve"> am besten sodass nicht schiebt </w:t>
       </w:r>
     </w:p>
     <w:p/>
@@ -933,9 +2846,14 @@
           <w:numId w:val="1"/>
         </w:numPr>
       </w:pPr>
+      <w:proofErr w:type="spellStart"/>
       <w:r>
         <w:lastRenderedPageBreak/>
-        <w:t xml:space="preserve">Reward anders definieren? </w:t>
+        <w:t>Reward</w:t>
+      </w:r>
+      <w:proofErr w:type="spellEnd"/>
+      <w:r>
+        <w:t xml:space="preserve"> anders definieren? </w:t>
       </w:r>
     </w:p>
     <w:p>
@@ -959,7 +2877,15 @@
         </w:numPr>
       </w:pPr>
       <w:r>
-        <w:t xml:space="preserve">Kann das Modell falsch sein? Ist aber gleich aufgebaut wie spot </w:t>
+        <w:t xml:space="preserve">Kann das Modell falsch sein? Ist aber gleich aufgebaut wie </w:t>
+      </w:r>
+      <w:proofErr w:type="spellStart"/>
+      <w:r>
+        <w:t>spot</w:t>
+      </w:r>
+      <w:proofErr w:type="spellEnd"/>
+      <w:r>
+        <w:t xml:space="preserve"> </w:t>
       </w:r>
     </w:p>
     <w:p>
@@ -989,7 +2915,39 @@
         </w:numPr>
       </w:pPr>
       <w:r>
-        <w:t>Wieso wird observation space verlassen? Kann da schon InitalVel 3* noch dazugesetzt aber ändert nicht so viel</w:t>
+        <w:t xml:space="preserve">Wieso wird </w:t>
+      </w:r>
+      <w:proofErr w:type="spellStart"/>
+      <w:r>
+        <w:t>observation</w:t>
+      </w:r>
+      <w:proofErr w:type="spellEnd"/>
+      <w:r>
+        <w:t xml:space="preserve"> </w:t>
+      </w:r>
+      <w:proofErr w:type="spellStart"/>
+      <w:r>
+        <w:t>space</w:t>
+      </w:r>
+      <w:proofErr w:type="spellEnd"/>
+      <w:r>
+        <w:t xml:space="preserve"> verlassen? Kann da schon </w:t>
+      </w:r>
+      <w:proofErr w:type="spellStart"/>
+      <w:proofErr w:type="gramStart"/>
+      <w:r>
+        <w:t>maxVel</w:t>
+      </w:r>
+      <w:proofErr w:type="spellEnd"/>
+      <w:r>
+        <w:t xml:space="preserve"> </w:t>
+      </w:r>
+      <w:r>
+        <w:t xml:space="preserve"> 3</w:t>
+      </w:r>
+      <w:proofErr w:type="gramEnd"/>
+      <w:r>
+        <w:t>* noch dazugesetzt aber ändert nicht so viel</w:t>
       </w:r>
     </w:p>
     <w:p>
@@ -1001,7 +2959,18 @@
         </w:numPr>
       </w:pPr>
       <w:r>
-        <w:t>Was macht legstate ? Das rumprobieren/ändern</w:t>
+        <w:t xml:space="preserve">Was macht </w:t>
+      </w:r>
+      <w:proofErr w:type="spellStart"/>
+      <w:r>
+        <w:t>legstate</w:t>
+      </w:r>
+      <w:proofErr w:type="spellEnd"/>
+      <w:r>
+        <w:t>? Das rumprobieren/ändern</w:t>
+      </w:r>
+      <w:r>
+        <w:t xml:space="preserve"> (habe ich von 100 auf 10) </w:t>
       </w:r>
     </w:p>
     <w:sectPr>

</xml_diff>

<commit_message>
tried longer training for better walking did not work
</commit_message>
<xml_diff>
--- a/NotizenModell.docx
+++ b/NotizenModell.docx
@@ -2876,6 +2876,7 @@
           <w:numId w:val="1"/>
         </w:numPr>
       </w:pPr>
+      <w:bookmarkStart w:id="0" w:name="_Hlk219209161"/>
       <w:r>
         <w:t xml:space="preserve">Kann das Modell falsch sein? Ist aber gleich aufgebaut wie </w:t>
       </w:r>
@@ -2888,6 +2889,7 @@
         <w:t xml:space="preserve"> </w:t>
       </w:r>
     </w:p>
+    <w:bookmarkEnd w:id="0"/>
     <w:p>
       <w:pPr>
         <w:pStyle w:val="Listenabsatz"/>
@@ -2973,6 +2975,98 @@
         <w:t xml:space="preserve"> (habe ich von 100 auf 10) </w:t>
       </w:r>
     </w:p>
+    <w:p/>
+    <w:p/>
+    <w:p>
+      <w:r>
+        <w:t>Notizen 13. 01</w:t>
+      </w:r>
+    </w:p>
+    <w:p/>
+    <w:p>
+      <w:r>
+        <w:t xml:space="preserve">Klingt nach evtl. </w:t>
+      </w:r>
+      <w:proofErr w:type="spellStart"/>
+      <w:r>
+        <w:t>problem</w:t>
+      </w:r>
+      <w:proofErr w:type="spellEnd"/>
+      <w:r>
+        <w:t xml:space="preserve"> der Simulation </w:t>
+      </w:r>
+    </w:p>
+    <w:p>
+      <w:proofErr w:type="spellStart"/>
+      <w:r>
+        <w:t>Zb</w:t>
+      </w:r>
+      <w:proofErr w:type="spellEnd"/>
+      <w:r>
+        <w:t xml:space="preserve"> </w:t>
+      </w:r>
+      <w:proofErr w:type="spellStart"/>
+      <w:r>
+        <w:t>anfangsgeschwindigkeit</w:t>
+      </w:r>
+      <w:proofErr w:type="spellEnd"/>
+      <w:r>
+        <w:t xml:space="preserve"> geben und schauen ob stehen bleibt</w:t>
+      </w:r>
+    </w:p>
+    <w:p>
+      <w:proofErr w:type="spellStart"/>
+      <w:r>
+        <w:t>Reward</w:t>
+      </w:r>
+      <w:proofErr w:type="spellEnd"/>
+      <w:r>
+        <w:t xml:space="preserve"> quadratisch, </w:t>
+      </w:r>
+      <w:proofErr w:type="spellStart"/>
+      <w:r>
+        <w:t>reward</w:t>
+      </w:r>
+      <w:proofErr w:type="spellEnd"/>
+      <w:r>
+        <w:t xml:space="preserve"> ausgeben lassen mit </w:t>
+      </w:r>
+      <w:proofErr w:type="spellStart"/>
+      <w:r>
+        <w:t>print</w:t>
+      </w:r>
+      <w:proofErr w:type="spellEnd"/>
+      <w:r>
+        <w:t xml:space="preserve"> </w:t>
+      </w:r>
+    </w:p>
+    <w:p>
+      <w:r>
+        <w:t xml:space="preserve">Viel debuggen in log </w:t>
+      </w:r>
+      <w:proofErr w:type="spellStart"/>
+      <w:r>
+        <w:t>file</w:t>
+      </w:r>
+      <w:proofErr w:type="spellEnd"/>
+      <w:r>
+        <w:t xml:space="preserve"> schreiben </w:t>
+      </w:r>
+    </w:p>
+    <w:p>
+      <w:pPr>
+        <w:pStyle w:val="Listenabsatz"/>
+        <w:numPr>
+          <w:ilvl w:val="0"/>
+          <w:numId w:val="2"/>
+        </w:numPr>
+      </w:pPr>
+      <w:r>
+        <w:t xml:space="preserve">Probleme zusammenschreiben und ihm schicken </w:t>
+      </w:r>
+    </w:p>
+    <w:p/>
+    <w:p/>
     <w:sectPr>
       <w:pgSz w:w="11906" w:h="16838"/>
       <w:pgMar w:top="1417" w:right="1417" w:bottom="1134" w:left="1417" w:header="708" w:footer="708" w:gutter="0"/>

</xml_diff>